<commit_message>
Agregar el analisis de la influencia del tamanio del problema
- Seccion 5.5 del informe con la variacion de T y de K
- Mediciones en resultados/tamanio/ (tiempo de computo, tiempo total del
  comando y barrido de K), con repeticiones y mediana
- graficos-tamanio.py con las tres figuras nuevas
- Con problemas chicos la version paralela resulta mas lenta que la serial,
  porque el arranque de MPI cuesta mas que la simulacion
</commit_message>
<xml_diff>
--- a/docs/informe-apa.docx
+++ b/docs/informe-apa.docx
@@ -23373,6 +23373,3179 @@
           <w:szCs w:val="24"/>
         </w:rPr>
         <w:t xml:space="preserve">En todos los escenarios, la probabilidad estimada converge a ~0.5070 con 2.000.000 de grupos frente al valor teórico de 0.5073, confirmando que la partición en bloques y la concurrencia no alteran los resultados matemáticos.</w:t>
+      </w:r>
+    </w:p>
+    <w:p>
+      <w:pPr>
+        <w:pStyle w:val="Heading2"/>
+        <w:spacing w:line="480"/>
+        <w:jc w:val="left"/>
+      </w:pPr>
+      <w:r>
+        <w:rPr>
+          <w:rFonts w:ascii="Times New Roman" w:cs="Times New Roman" w:eastAsia="Times New Roman" w:hAnsi="Times New Roman"/>
+          <w:b/>
+          <w:bCs/>
+          <w:sz w:val="24"/>
+          <w:szCs w:val="24"/>
+        </w:rPr>
+        <w:t xml:space="preserve">Influencia del tamaño del problema</w:t>
+      </w:r>
+    </w:p>
+    <w:p>
+      <w:pPr>
+        <w:spacing w:line="480"/>
+        <w:ind w:firstLine="720"/>
+      </w:pPr>
+      <w:r>
+        <w:rPr>
+          <w:rFonts w:ascii="Times New Roman" w:cs="Times New Roman" w:eastAsia="Times New Roman" w:hAnsi="Times New Roman"/>
+          <w:sz w:val="24"/>
+          <w:szCs w:val="24"/>
+        </w:rPr>
+        <w:t xml:space="preserve">Las mediciones anteriores se realizaron siempre con dos millones de grupos. Esta sección analiza cómo cambia el speedup al variar el tamaño del problema. Las mediciones corresponden a la notebook de Nicolás y se reporta la mediana de las repeticiones de cada configuración.</w:t>
+      </w:r>
+    </w:p>
+    <w:p>
+      <w:pPr>
+        <w:spacing w:line="480"/>
+        <w:ind w:firstLine="720"/>
+      </w:pPr>
+      <w:r>
+        <w:rPr>
+          <w:rFonts w:ascii="Times New Roman" w:cs="Times New Roman" w:eastAsia="Times New Roman" w:hAnsi="Times New Roman"/>
+          <w:sz w:val="24"/>
+          <w:szCs w:val="24"/>
+        </w:rPr>
+        <w:t xml:space="preserve">Conviene distinguir dos magnitudes que podrían confundirse: </w:t>
+      </w:r>
+      <w:r>
+        <w:rPr>
+          <w:rFonts w:ascii="Times New Roman" w:cs="Times New Roman" w:eastAsia="Times New Roman" w:hAnsi="Times New Roman"/>
+          <w:b/>
+          <w:bCs/>
+          <w:sz w:val="24"/>
+          <w:szCs w:val="24"/>
+        </w:rPr>
+        <w:t xml:space="preserve">T</w:t>
+      </w:r>
+      <w:r>
+        <w:rPr>
+          <w:rFonts w:ascii="Times New Roman" w:cs="Times New Roman" w:eastAsia="Times New Roman" w:hAnsi="Times New Roman"/>
+          <w:sz w:val="24"/>
+          <w:szCs w:val="24"/>
+        </w:rPr>
+        <w:t xml:space="preserve">, la cantidad de grupos simulados, que determina el volumen total de trabajo, y </w:t>
+      </w:r>
+      <w:r>
+        <w:rPr>
+          <w:rFonts w:ascii="Times New Roman" w:cs="Times New Roman" w:eastAsia="Times New Roman" w:hAnsi="Times New Roman"/>
+          <w:b/>
+          <w:bCs/>
+          <w:sz w:val="24"/>
+          <w:szCs w:val="24"/>
+        </w:rPr>
+        <w:t xml:space="preserve">K</w:t>
+      </w:r>
+      <w:r>
+        <w:rPr>
+          <w:rFonts w:ascii="Times New Roman" w:cs="Times New Roman" w:eastAsia="Times New Roman" w:hAnsi="Times New Roman"/>
+          <w:sz w:val="24"/>
+          <w:szCs w:val="24"/>
+        </w:rPr>
+        <w:t xml:space="preserve">, la cantidad de personas por grupo, que determina el trabajo dentro de cada unidad.</w:t>
+      </w:r>
+    </w:p>
+    <w:p>
+      <w:pPr>
+        <w:pStyle w:val="Heading3"/>
+        <w:spacing w:line="480"/>
+        <w:jc w:val="left"/>
+      </w:pPr>
+      <w:r>
+        <w:rPr>
+          <w:rFonts w:ascii="Times New Roman" w:cs="Times New Roman" w:eastAsia="Times New Roman" w:hAnsi="Times New Roman"/>
+          <w:b/>
+          <w:bCs/>
+          <w:i/>
+          <w:iCs/>
+          <w:sz w:val="24"/>
+          <w:szCs w:val="24"/>
+        </w:rPr>
+        <w:t xml:space="preserve">Variación de la cantidad de grupos (T)</w:t>
+      </w:r>
+    </w:p>
+    <w:p>
+      <w:pPr>
+        <w:spacing w:line="480"/>
+        <w:ind w:firstLine="720"/>
+      </w:pPr>
+      <w:r>
+        <w:rPr>
+          <w:rFonts w:ascii="Times New Roman" w:cs="Times New Roman" w:eastAsia="Times New Roman" w:hAnsi="Times New Roman"/>
+          <w:sz w:val="24"/>
+          <w:szCs w:val="24"/>
+        </w:rPr>
+        <w:t xml:space="preserve">Tiempo de cómputo medido con </w:t>
+      </w:r>
+      <w:r>
+        <w:rPr>
+          <w:rFonts w:ascii="Courier New" w:cs="Courier New" w:eastAsia="Courier New" w:hAnsi="Courier New"/>
+          <w:sz w:val="24"/>
+          <w:szCs w:val="24"/>
+        </w:rPr>
+        <w:t xml:space="preserve">MPI_Wtime</w:t>
+      </w:r>
+      <w:r>
+        <w:rPr>
+          <w:rFonts w:ascii="Times New Roman" w:cs="Times New Roman" w:eastAsia="Times New Roman" w:hAnsi="Times New Roman"/>
+          <w:sz w:val="24"/>
+          <w:szCs w:val="24"/>
+        </w:rPr>
+        <w:t xml:space="preserve">, con K=23 y mediana de siete corridas:</w:t>
+      </w:r>
+    </w:p>
+    <w:p>
+      <w:pPr>
+        <w:spacing w:before="240" w:line="240"/>
+      </w:pPr>
+      <w:r>
+        <w:rPr>
+          <w:rFonts w:ascii="Times New Roman" w:cs="Times New Roman" w:eastAsia="Times New Roman" w:hAnsi="Times New Roman"/>
+          <w:b/>
+          <w:bCs/>
+          <w:sz w:val="24"/>
+          <w:szCs w:val="24"/>
+        </w:rPr>
+        <w:t xml:space="preserve">Tabla 11</w:t>
+      </w:r>
+    </w:p>
+    <w:p>
+      <w:pPr>
+        <w:spacing w:after="80" w:line="240"/>
+      </w:pPr>
+      <w:r>
+        <w:rPr>
+          <w:rFonts w:ascii="Times New Roman" w:cs="Times New Roman" w:eastAsia="Times New Roman" w:hAnsi="Times New Roman"/>
+          <w:i/>
+          <w:iCs/>
+          <w:sz w:val="24"/>
+          <w:szCs w:val="24"/>
+        </w:rPr>
+        <w:t xml:space="preserve"/>
+      </w:r>
+    </w:p>
+    <w:tbl>
+      <w:tblPr>
+        <w:tblW w:type="dxa" w:w="9360"/>
+        <w:tblBorders>
+          <w:top w:val="single" w:color="000000" w:sz="6"/>
+          <w:left w:val="none" w:color="FFFFFF" w:sz="0"/>
+          <w:bottom w:val="single" w:color="000000" w:sz="6"/>
+          <w:right w:val="none" w:color="FFFFFF" w:sz="0"/>
+          <w:insideH w:val="none" w:color="FFFFFF" w:sz="0"/>
+          <w:insideV w:val="none" w:color="FFFFFF" w:sz="0"/>
+        </w:tblBorders>
+      </w:tblPr>
+      <w:tblGrid>
+        <w:gridCol w:w="1337"/>
+        <w:gridCol w:w="1337"/>
+        <w:gridCol w:w="1337"/>
+        <w:gridCol w:w="1337"/>
+        <w:gridCol w:w="1337"/>
+        <w:gridCol w:w="1337"/>
+        <w:gridCol w:w="1338"/>
+      </w:tblGrid>
+      <w:tr>
+        <w:trPr>
+          <w:tblHeader/>
+        </w:trPr>
+        <w:tc>
+          <w:tcPr>
+            <w:tcW w:type="dxa" w:w="1337"/>
+            <w:tcBorders>
+              <w:bottom w:val="single" w:color="000000" w:sz="6"/>
+            </w:tcBorders>
+            <w:tcMar>
+              <w:top w:type="dxa" w:w="40"/>
+              <w:left w:type="dxa" w:w="80"/>
+              <w:bottom w:type="dxa" w:w="40"/>
+              <w:right w:type="dxa" w:w="80"/>
+            </w:tcMar>
+          </w:tcPr>
+          <w:p>
+            <w:pPr>
+              <w:spacing w:line="240"/>
+            </w:pPr>
+            <w:r>
+              <w:rPr>
+                <w:rFonts w:ascii="Times New Roman" w:cs="Times New Roman" w:eastAsia="Times New Roman" w:hAnsi="Times New Roman"/>
+                <w:i w:val="false"/>
+                <w:iCs w:val="false"/>
+                <w:sz w:val="20"/>
+                <w:szCs w:val="20"/>
+              </w:rPr>
+              <w:t xml:space="preserve">T (grupos)</w:t>
+            </w:r>
+          </w:p>
+        </w:tc>
+        <w:tc>
+          <w:tcPr>
+            <w:tcW w:type="dxa" w:w="1337"/>
+            <w:tcBorders>
+              <w:bottom w:val="single" w:color="000000" w:sz="6"/>
+            </w:tcBorders>
+            <w:tcMar>
+              <w:top w:type="dxa" w:w="40"/>
+              <w:left w:type="dxa" w:w="80"/>
+              <w:bottom w:type="dxa" w:w="40"/>
+              <w:right w:type="dxa" w:w="80"/>
+            </w:tcMar>
+          </w:tcPr>
+          <w:p>
+            <w:pPr>
+              <w:spacing w:line="240"/>
+            </w:pPr>
+            <w:r>
+              <w:rPr>
+                <w:rFonts w:ascii="Times New Roman" w:cs="Times New Roman" w:eastAsia="Times New Roman" w:hAnsi="Times New Roman"/>
+                <w:i w:val="false"/>
+                <w:iCs w:val="false"/>
+                <w:sz w:val="20"/>
+                <w:szCs w:val="20"/>
+              </w:rPr>
+              <w:t xml:space="preserve">T_serial</w:t>
+            </w:r>
+          </w:p>
+        </w:tc>
+        <w:tc>
+          <w:tcPr>
+            <w:tcW w:type="dxa" w:w="1337"/>
+            <w:tcBorders>
+              <w:bottom w:val="single" w:color="000000" w:sz="6"/>
+            </w:tcBorders>
+            <w:tcMar>
+              <w:top w:type="dxa" w:w="40"/>
+              <w:left w:type="dxa" w:w="80"/>
+              <w:bottom w:type="dxa" w:w="40"/>
+              <w:right w:type="dxa" w:w="80"/>
+            </w:tcMar>
+          </w:tcPr>
+          <w:p>
+            <w:pPr>
+              <w:spacing w:line="240"/>
+            </w:pPr>
+            <w:r>
+              <w:rPr>
+                <w:rFonts w:ascii="Times New Roman" w:cs="Times New Roman" w:eastAsia="Times New Roman" w:hAnsi="Times New Roman"/>
+                <w:i w:val="false"/>
+                <w:iCs w:val="false"/>
+                <w:sz w:val="20"/>
+                <w:szCs w:val="20"/>
+              </w:rPr>
+              <w:t xml:space="preserve">Speedup p=2</w:t>
+            </w:r>
+          </w:p>
+        </w:tc>
+        <w:tc>
+          <w:tcPr>
+            <w:tcW w:type="dxa" w:w="1337"/>
+            <w:tcBorders>
+              <w:bottom w:val="single" w:color="000000" w:sz="6"/>
+            </w:tcBorders>
+            <w:tcMar>
+              <w:top w:type="dxa" w:w="40"/>
+              <w:left w:type="dxa" w:w="80"/>
+              <w:bottom w:type="dxa" w:w="40"/>
+              <w:right w:type="dxa" w:w="80"/>
+            </w:tcMar>
+          </w:tcPr>
+          <w:p>
+            <w:pPr>
+              <w:spacing w:line="240"/>
+            </w:pPr>
+            <w:r>
+              <w:rPr>
+                <w:rFonts w:ascii="Times New Roman" w:cs="Times New Roman" w:eastAsia="Times New Roman" w:hAnsi="Times New Roman"/>
+                <w:i w:val="false"/>
+                <w:iCs w:val="false"/>
+                <w:sz w:val="20"/>
+                <w:szCs w:val="20"/>
+              </w:rPr>
+              <w:t xml:space="preserve">p=4</w:t>
+            </w:r>
+          </w:p>
+        </w:tc>
+        <w:tc>
+          <w:tcPr>
+            <w:tcW w:type="dxa" w:w="1337"/>
+            <w:tcBorders>
+              <w:bottom w:val="single" w:color="000000" w:sz="6"/>
+            </w:tcBorders>
+            <w:tcMar>
+              <w:top w:type="dxa" w:w="40"/>
+              <w:left w:type="dxa" w:w="80"/>
+              <w:bottom w:type="dxa" w:w="40"/>
+              <w:right w:type="dxa" w:w="80"/>
+            </w:tcMar>
+          </w:tcPr>
+          <w:p>
+            <w:pPr>
+              <w:spacing w:line="240"/>
+            </w:pPr>
+            <w:r>
+              <w:rPr>
+                <w:rFonts w:ascii="Times New Roman" w:cs="Times New Roman" w:eastAsia="Times New Roman" w:hAnsi="Times New Roman"/>
+                <w:i w:val="false"/>
+                <w:iCs w:val="false"/>
+                <w:sz w:val="20"/>
+                <w:szCs w:val="20"/>
+              </w:rPr>
+              <w:t xml:space="preserve">p=6</w:t>
+            </w:r>
+          </w:p>
+        </w:tc>
+        <w:tc>
+          <w:tcPr>
+            <w:tcW w:type="dxa" w:w="1337"/>
+            <w:tcBorders>
+              <w:bottom w:val="single" w:color="000000" w:sz="6"/>
+            </w:tcBorders>
+            <w:tcMar>
+              <w:top w:type="dxa" w:w="40"/>
+              <w:left w:type="dxa" w:w="80"/>
+              <w:bottom w:type="dxa" w:w="40"/>
+              <w:right w:type="dxa" w:w="80"/>
+            </w:tcMar>
+          </w:tcPr>
+          <w:p>
+            <w:pPr>
+              <w:spacing w:line="240"/>
+            </w:pPr>
+            <w:r>
+              <w:rPr>
+                <w:rFonts w:ascii="Times New Roman" w:cs="Times New Roman" w:eastAsia="Times New Roman" w:hAnsi="Times New Roman"/>
+                <w:i w:val="false"/>
+                <w:iCs w:val="false"/>
+                <w:sz w:val="20"/>
+                <w:szCs w:val="20"/>
+              </w:rPr>
+              <w:t xml:space="preserve">p=8</w:t>
+            </w:r>
+          </w:p>
+        </w:tc>
+        <w:tc>
+          <w:tcPr>
+            <w:tcW w:type="dxa" w:w="1338"/>
+            <w:tcBorders>
+              <w:bottom w:val="single" w:color="000000" w:sz="6"/>
+            </w:tcBorders>
+            <w:tcMar>
+              <w:top w:type="dxa" w:w="40"/>
+              <w:left w:type="dxa" w:w="80"/>
+              <w:bottom w:type="dxa" w:w="40"/>
+              <w:right w:type="dxa" w:w="80"/>
+            </w:tcMar>
+          </w:tcPr>
+          <w:p>
+            <w:pPr>
+              <w:spacing w:line="240"/>
+            </w:pPr>
+            <w:r>
+              <w:rPr>
+                <w:rFonts w:ascii="Times New Roman" w:cs="Times New Roman" w:eastAsia="Times New Roman" w:hAnsi="Times New Roman"/>
+                <w:i w:val="false"/>
+                <w:iCs w:val="false"/>
+                <w:sz w:val="20"/>
+                <w:szCs w:val="20"/>
+              </w:rPr>
+              <w:t xml:space="preserve">p=10</w:t>
+            </w:r>
+          </w:p>
+        </w:tc>
+      </w:tr>
+      <w:tr>
+        <w:trPr>
+          <w:tblHeader w:val="off"/>
+        </w:trPr>
+        <w:tc>
+          <w:tcPr>
+            <w:tcW w:type="dxa" w:w="1337"/>
+            <w:tcMar>
+              <w:top w:type="dxa" w:w="40"/>
+              <w:left w:type="dxa" w:w="80"/>
+              <w:bottom w:type="dxa" w:w="40"/>
+              <w:right w:type="dxa" w:w="80"/>
+            </w:tcMar>
+          </w:tcPr>
+          <w:p>
+            <w:pPr>
+              <w:spacing w:line="240"/>
+            </w:pPr>
+            <w:r>
+              <w:rPr>
+                <w:rFonts w:ascii="Times New Roman" w:cs="Times New Roman" w:eastAsia="Times New Roman" w:hAnsi="Times New Roman"/>
+                <w:i w:val="false"/>
+                <w:iCs w:val="false"/>
+                <w:sz w:val="20"/>
+                <w:szCs w:val="20"/>
+              </w:rPr>
+              <w:t xml:space="preserve">1.000</w:t>
+            </w:r>
+          </w:p>
+        </w:tc>
+        <w:tc>
+          <w:tcPr>
+            <w:tcW w:type="dxa" w:w="1337"/>
+            <w:tcMar>
+              <w:top w:type="dxa" w:w="40"/>
+              <w:left w:type="dxa" w:w="80"/>
+              <w:bottom w:type="dxa" w:w="40"/>
+              <w:right w:type="dxa" w:w="80"/>
+            </w:tcMar>
+          </w:tcPr>
+          <w:p>
+            <w:pPr>
+              <w:spacing w:line="240"/>
+            </w:pPr>
+            <w:r>
+              <w:rPr>
+                <w:rFonts w:ascii="Times New Roman" w:cs="Times New Roman" w:eastAsia="Times New Roman" w:hAnsi="Times New Roman"/>
+                <w:i w:val="false"/>
+                <w:iCs w:val="false"/>
+                <w:sz w:val="20"/>
+                <w:szCs w:val="20"/>
+              </w:rPr>
+              <w:t xml:space="preserve">0.00045 s</w:t>
+            </w:r>
+          </w:p>
+        </w:tc>
+        <w:tc>
+          <w:tcPr>
+            <w:tcW w:type="dxa" w:w="1337"/>
+            <w:tcMar>
+              <w:top w:type="dxa" w:w="40"/>
+              <w:left w:type="dxa" w:w="80"/>
+              <w:bottom w:type="dxa" w:w="40"/>
+              <w:right w:type="dxa" w:w="80"/>
+            </w:tcMar>
+          </w:tcPr>
+          <w:p>
+            <w:pPr>
+              <w:spacing w:line="240"/>
+            </w:pPr>
+            <w:r>
+              <w:rPr>
+                <w:rFonts w:ascii="Times New Roman" w:cs="Times New Roman" w:eastAsia="Times New Roman" w:hAnsi="Times New Roman"/>
+                <w:i w:val="false"/>
+                <w:iCs w:val="false"/>
+                <w:sz w:val="20"/>
+                <w:szCs w:val="20"/>
+              </w:rPr>
+              <w:t xml:space="preserve">1.81</w:t>
+            </w:r>
+          </w:p>
+        </w:tc>
+        <w:tc>
+          <w:tcPr>
+            <w:tcW w:type="dxa" w:w="1337"/>
+            <w:tcMar>
+              <w:top w:type="dxa" w:w="40"/>
+              <w:left w:type="dxa" w:w="80"/>
+              <w:bottom w:type="dxa" w:w="40"/>
+              <w:right w:type="dxa" w:w="80"/>
+            </w:tcMar>
+          </w:tcPr>
+          <w:p>
+            <w:pPr>
+              <w:spacing w:line="240"/>
+            </w:pPr>
+            <w:r>
+              <w:rPr>
+                <w:rFonts w:ascii="Times New Roman" w:cs="Times New Roman" w:eastAsia="Times New Roman" w:hAnsi="Times New Roman"/>
+                <w:i w:val="false"/>
+                <w:iCs w:val="false"/>
+                <w:sz w:val="20"/>
+                <w:szCs w:val="20"/>
+              </w:rPr>
+              <w:t xml:space="preserve">3.75</w:t>
+            </w:r>
+          </w:p>
+        </w:tc>
+        <w:tc>
+          <w:tcPr>
+            <w:tcW w:type="dxa" w:w="1337"/>
+            <w:tcMar>
+              <w:top w:type="dxa" w:w="40"/>
+              <w:left w:type="dxa" w:w="80"/>
+              <w:bottom w:type="dxa" w:w="40"/>
+              <w:right w:type="dxa" w:w="80"/>
+            </w:tcMar>
+          </w:tcPr>
+          <w:p>
+            <w:pPr>
+              <w:spacing w:line="240"/>
+            </w:pPr>
+            <w:r>
+              <w:rPr>
+                <w:rFonts w:ascii="Times New Roman" w:cs="Times New Roman" w:eastAsia="Times New Roman" w:hAnsi="Times New Roman"/>
+                <w:i w:val="false"/>
+                <w:iCs w:val="false"/>
+                <w:sz w:val="20"/>
+                <w:szCs w:val="20"/>
+              </w:rPr>
+              <w:t xml:space="preserve">5.56</w:t>
+            </w:r>
+          </w:p>
+        </w:tc>
+        <w:tc>
+          <w:tcPr>
+            <w:tcW w:type="dxa" w:w="1337"/>
+            <w:tcMar>
+              <w:top w:type="dxa" w:w="40"/>
+              <w:left w:type="dxa" w:w="80"/>
+              <w:bottom w:type="dxa" w:w="40"/>
+              <w:right w:type="dxa" w:w="80"/>
+            </w:tcMar>
+          </w:tcPr>
+          <w:p>
+            <w:pPr>
+              <w:spacing w:line="240"/>
+            </w:pPr>
+            <w:r>
+              <w:rPr>
+                <w:rFonts w:ascii="Times New Roman" w:cs="Times New Roman" w:eastAsia="Times New Roman" w:hAnsi="Times New Roman"/>
+                <w:i w:val="false"/>
+                <w:iCs w:val="false"/>
+                <w:sz w:val="20"/>
+                <w:szCs w:val="20"/>
+              </w:rPr>
+              <w:t xml:space="preserve">3.33</w:t>
+            </w:r>
+          </w:p>
+        </w:tc>
+        <w:tc>
+          <w:tcPr>
+            <w:tcW w:type="dxa" w:w="1338"/>
+            <w:tcMar>
+              <w:top w:type="dxa" w:w="40"/>
+              <w:left w:type="dxa" w:w="80"/>
+              <w:bottom w:type="dxa" w:w="40"/>
+              <w:right w:type="dxa" w:w="80"/>
+            </w:tcMar>
+          </w:tcPr>
+          <w:p>
+            <w:pPr>
+              <w:spacing w:line="240"/>
+            </w:pPr>
+            <w:r>
+              <w:rPr>
+                <w:rFonts w:ascii="Times New Roman" w:cs="Times New Roman" w:eastAsia="Times New Roman" w:hAnsi="Times New Roman"/>
+                <w:i w:val="false"/>
+                <w:iCs w:val="false"/>
+                <w:sz w:val="20"/>
+                <w:szCs w:val="20"/>
+              </w:rPr>
+              <w:t xml:space="preserve">3.38</w:t>
+            </w:r>
+          </w:p>
+        </w:tc>
+      </w:tr>
+      <w:tr>
+        <w:trPr>
+          <w:tblHeader w:val="off"/>
+        </w:trPr>
+        <w:tc>
+          <w:tcPr>
+            <w:tcW w:type="dxa" w:w="1337"/>
+            <w:tcMar>
+              <w:top w:type="dxa" w:w="40"/>
+              <w:left w:type="dxa" w:w="80"/>
+              <w:bottom w:type="dxa" w:w="40"/>
+              <w:right w:type="dxa" w:w="80"/>
+            </w:tcMar>
+          </w:tcPr>
+          <w:p>
+            <w:pPr>
+              <w:spacing w:line="240"/>
+            </w:pPr>
+            <w:r>
+              <w:rPr>
+                <w:rFonts w:ascii="Times New Roman" w:cs="Times New Roman" w:eastAsia="Times New Roman" w:hAnsi="Times New Roman"/>
+                <w:i w:val="false"/>
+                <w:iCs w:val="false"/>
+                <w:sz w:val="20"/>
+                <w:szCs w:val="20"/>
+              </w:rPr>
+              <w:t xml:space="preserve">10.000</w:t>
+            </w:r>
+          </w:p>
+        </w:tc>
+        <w:tc>
+          <w:tcPr>
+            <w:tcW w:type="dxa" w:w="1337"/>
+            <w:tcMar>
+              <w:top w:type="dxa" w:w="40"/>
+              <w:left w:type="dxa" w:w="80"/>
+              <w:bottom w:type="dxa" w:w="40"/>
+              <w:right w:type="dxa" w:w="80"/>
+            </w:tcMar>
+          </w:tcPr>
+          <w:p>
+            <w:pPr>
+              <w:spacing w:line="240"/>
+            </w:pPr>
+            <w:r>
+              <w:rPr>
+                <w:rFonts w:ascii="Times New Roman" w:cs="Times New Roman" w:eastAsia="Times New Roman" w:hAnsi="Times New Roman"/>
+                <w:i w:val="false"/>
+                <w:iCs w:val="false"/>
+                <w:sz w:val="20"/>
+                <w:szCs w:val="20"/>
+              </w:rPr>
+              <w:t xml:space="preserve">0.00456 s</w:t>
+            </w:r>
+          </w:p>
+        </w:tc>
+        <w:tc>
+          <w:tcPr>
+            <w:tcW w:type="dxa" w:w="1337"/>
+            <w:tcMar>
+              <w:top w:type="dxa" w:w="40"/>
+              <w:left w:type="dxa" w:w="80"/>
+              <w:bottom w:type="dxa" w:w="40"/>
+              <w:right w:type="dxa" w:w="80"/>
+            </w:tcMar>
+          </w:tcPr>
+          <w:p>
+            <w:pPr>
+              <w:spacing w:line="240"/>
+            </w:pPr>
+            <w:r>
+              <w:rPr>
+                <w:rFonts w:ascii="Times New Roman" w:cs="Times New Roman" w:eastAsia="Times New Roman" w:hAnsi="Times New Roman"/>
+                <w:i w:val="false"/>
+                <w:iCs w:val="false"/>
+                <w:sz w:val="20"/>
+                <w:szCs w:val="20"/>
+              </w:rPr>
+              <w:t xml:space="preserve">1.94</w:t>
+            </w:r>
+          </w:p>
+        </w:tc>
+        <w:tc>
+          <w:tcPr>
+            <w:tcW w:type="dxa" w:w="1337"/>
+            <w:tcMar>
+              <w:top w:type="dxa" w:w="40"/>
+              <w:left w:type="dxa" w:w="80"/>
+              <w:bottom w:type="dxa" w:w="40"/>
+              <w:right w:type="dxa" w:w="80"/>
+            </w:tcMar>
+          </w:tcPr>
+          <w:p>
+            <w:pPr>
+              <w:spacing w:line="240"/>
+            </w:pPr>
+            <w:r>
+              <w:rPr>
+                <w:rFonts w:ascii="Times New Roman" w:cs="Times New Roman" w:eastAsia="Times New Roman" w:hAnsi="Times New Roman"/>
+                <w:i w:val="false"/>
+                <w:iCs w:val="false"/>
+                <w:sz w:val="20"/>
+                <w:szCs w:val="20"/>
+              </w:rPr>
+              <w:t xml:space="preserve">3.80</w:t>
+            </w:r>
+          </w:p>
+        </w:tc>
+        <w:tc>
+          <w:tcPr>
+            <w:tcW w:type="dxa" w:w="1337"/>
+            <w:tcMar>
+              <w:top w:type="dxa" w:w="40"/>
+              <w:left w:type="dxa" w:w="80"/>
+              <w:bottom w:type="dxa" w:w="40"/>
+              <w:right w:type="dxa" w:w="80"/>
+            </w:tcMar>
+          </w:tcPr>
+          <w:p>
+            <w:pPr>
+              <w:spacing w:line="240"/>
+            </w:pPr>
+            <w:r>
+              <w:rPr>
+                <w:rFonts w:ascii="Times New Roman" w:cs="Times New Roman" w:eastAsia="Times New Roman" w:hAnsi="Times New Roman"/>
+                <w:i w:val="false"/>
+                <w:iCs w:val="false"/>
+                <w:sz w:val="20"/>
+                <w:szCs w:val="20"/>
+              </w:rPr>
+              <w:t xml:space="preserve">5.70</w:t>
+            </w:r>
+          </w:p>
+        </w:tc>
+        <w:tc>
+          <w:tcPr>
+            <w:tcW w:type="dxa" w:w="1337"/>
+            <w:tcMar>
+              <w:top w:type="dxa" w:w="40"/>
+              <w:left w:type="dxa" w:w="80"/>
+              <w:bottom w:type="dxa" w:w="40"/>
+              <w:right w:type="dxa" w:w="80"/>
+            </w:tcMar>
+          </w:tcPr>
+          <w:p>
+            <w:pPr>
+              <w:spacing w:line="240"/>
+            </w:pPr>
+            <w:r>
+              <w:rPr>
+                <w:rFonts w:ascii="Times New Roman" w:cs="Times New Roman" w:eastAsia="Times New Roman" w:hAnsi="Times New Roman"/>
+                <w:i w:val="false"/>
+                <w:iCs w:val="false"/>
+                <w:sz w:val="20"/>
+                <w:szCs w:val="20"/>
+              </w:rPr>
+              <w:t xml:space="preserve">4.45</w:t>
+            </w:r>
+          </w:p>
+        </w:tc>
+        <w:tc>
+          <w:tcPr>
+            <w:tcW w:type="dxa" w:w="1338"/>
+            <w:tcMar>
+              <w:top w:type="dxa" w:w="40"/>
+              <w:left w:type="dxa" w:w="80"/>
+              <w:bottom w:type="dxa" w:w="40"/>
+              <w:right w:type="dxa" w:w="80"/>
+            </w:tcMar>
+          </w:tcPr>
+          <w:p>
+            <w:pPr>
+              <w:spacing w:line="240"/>
+            </w:pPr>
+            <w:r>
+              <w:rPr>
+                <w:rFonts w:ascii="Times New Roman" w:cs="Times New Roman" w:eastAsia="Times New Roman" w:hAnsi="Times New Roman"/>
+                <w:i w:val="false"/>
+                <w:iCs w:val="false"/>
+                <w:sz w:val="20"/>
+                <w:szCs w:val="20"/>
+              </w:rPr>
+              <w:t xml:space="preserve">4.40</w:t>
+            </w:r>
+          </w:p>
+        </w:tc>
+      </w:tr>
+      <w:tr>
+        <w:trPr>
+          <w:tblHeader w:val="off"/>
+        </w:trPr>
+        <w:tc>
+          <w:tcPr>
+            <w:tcW w:type="dxa" w:w="1337"/>
+            <w:tcMar>
+              <w:top w:type="dxa" w:w="40"/>
+              <w:left w:type="dxa" w:w="80"/>
+              <w:bottom w:type="dxa" w:w="40"/>
+              <w:right w:type="dxa" w:w="80"/>
+            </w:tcMar>
+          </w:tcPr>
+          <w:p>
+            <w:pPr>
+              <w:spacing w:line="240"/>
+            </w:pPr>
+            <w:r>
+              <w:rPr>
+                <w:rFonts w:ascii="Times New Roman" w:cs="Times New Roman" w:eastAsia="Times New Roman" w:hAnsi="Times New Roman"/>
+                <w:i w:val="false"/>
+                <w:iCs w:val="false"/>
+                <w:sz w:val="20"/>
+                <w:szCs w:val="20"/>
+              </w:rPr>
+              <w:t xml:space="preserve">100.000</w:t>
+            </w:r>
+          </w:p>
+        </w:tc>
+        <w:tc>
+          <w:tcPr>
+            <w:tcW w:type="dxa" w:w="1337"/>
+            <w:tcMar>
+              <w:top w:type="dxa" w:w="40"/>
+              <w:left w:type="dxa" w:w="80"/>
+              <w:bottom w:type="dxa" w:w="40"/>
+              <w:right w:type="dxa" w:w="80"/>
+            </w:tcMar>
+          </w:tcPr>
+          <w:p>
+            <w:pPr>
+              <w:spacing w:line="240"/>
+            </w:pPr>
+            <w:r>
+              <w:rPr>
+                <w:rFonts w:ascii="Times New Roman" w:cs="Times New Roman" w:eastAsia="Times New Roman" w:hAnsi="Times New Roman"/>
+                <w:i w:val="false"/>
+                <w:iCs w:val="false"/>
+                <w:sz w:val="20"/>
+                <w:szCs w:val="20"/>
+              </w:rPr>
+              <w:t xml:space="preserve">0.04553 s</w:t>
+            </w:r>
+          </w:p>
+        </w:tc>
+        <w:tc>
+          <w:tcPr>
+            <w:tcW w:type="dxa" w:w="1337"/>
+            <w:tcMar>
+              <w:top w:type="dxa" w:w="40"/>
+              <w:left w:type="dxa" w:w="80"/>
+              <w:bottom w:type="dxa" w:w="40"/>
+              <w:right w:type="dxa" w:w="80"/>
+            </w:tcMar>
+          </w:tcPr>
+          <w:p>
+            <w:pPr>
+              <w:spacing w:line="240"/>
+            </w:pPr>
+            <w:r>
+              <w:rPr>
+                <w:rFonts w:ascii="Times New Roman" w:cs="Times New Roman" w:eastAsia="Times New Roman" w:hAnsi="Times New Roman"/>
+                <w:i w:val="false"/>
+                <w:iCs w:val="false"/>
+                <w:sz w:val="20"/>
+                <w:szCs w:val="20"/>
+              </w:rPr>
+              <w:t xml:space="preserve">1.95</w:t>
+            </w:r>
+          </w:p>
+        </w:tc>
+        <w:tc>
+          <w:tcPr>
+            <w:tcW w:type="dxa" w:w="1337"/>
+            <w:tcMar>
+              <w:top w:type="dxa" w:w="40"/>
+              <w:left w:type="dxa" w:w="80"/>
+              <w:bottom w:type="dxa" w:w="40"/>
+              <w:right w:type="dxa" w:w="80"/>
+            </w:tcMar>
+          </w:tcPr>
+          <w:p>
+            <w:pPr>
+              <w:spacing w:line="240"/>
+            </w:pPr>
+            <w:r>
+              <w:rPr>
+                <w:rFonts w:ascii="Times New Roman" w:cs="Times New Roman" w:eastAsia="Times New Roman" w:hAnsi="Times New Roman"/>
+                <w:i w:val="false"/>
+                <w:iCs w:val="false"/>
+                <w:sz w:val="20"/>
+                <w:szCs w:val="20"/>
+              </w:rPr>
+              <w:t xml:space="preserve">3.83</w:t>
+            </w:r>
+          </w:p>
+        </w:tc>
+        <w:tc>
+          <w:tcPr>
+            <w:tcW w:type="dxa" w:w="1337"/>
+            <w:tcMar>
+              <w:top w:type="dxa" w:w="40"/>
+              <w:left w:type="dxa" w:w="80"/>
+              <w:bottom w:type="dxa" w:w="40"/>
+              <w:right w:type="dxa" w:w="80"/>
+            </w:tcMar>
+          </w:tcPr>
+          <w:p>
+            <w:pPr>
+              <w:spacing w:line="240"/>
+            </w:pPr>
+            <w:r>
+              <w:rPr>
+                <w:rFonts w:ascii="Times New Roman" w:cs="Times New Roman" w:eastAsia="Times New Roman" w:hAnsi="Times New Roman"/>
+                <w:i w:val="false"/>
+                <w:iCs w:val="false"/>
+                <w:sz w:val="20"/>
+                <w:szCs w:val="20"/>
+              </w:rPr>
+              <w:t xml:space="preserve">5.55</w:t>
+            </w:r>
+          </w:p>
+        </w:tc>
+        <w:tc>
+          <w:tcPr>
+            <w:tcW w:type="dxa" w:w="1337"/>
+            <w:tcMar>
+              <w:top w:type="dxa" w:w="40"/>
+              <w:left w:type="dxa" w:w="80"/>
+              <w:bottom w:type="dxa" w:w="40"/>
+              <w:right w:type="dxa" w:w="80"/>
+            </w:tcMar>
+          </w:tcPr>
+          <w:p>
+            <w:pPr>
+              <w:spacing w:line="240"/>
+            </w:pPr>
+            <w:r>
+              <w:rPr>
+                <w:rFonts w:ascii="Times New Roman" w:cs="Times New Roman" w:eastAsia="Times New Roman" w:hAnsi="Times New Roman"/>
+                <w:i w:val="false"/>
+                <w:iCs w:val="false"/>
+                <w:sz w:val="20"/>
+                <w:szCs w:val="20"/>
+              </w:rPr>
+              <w:t xml:space="preserve">4.65</w:t>
+            </w:r>
+          </w:p>
+        </w:tc>
+        <w:tc>
+          <w:tcPr>
+            <w:tcW w:type="dxa" w:w="1338"/>
+            <w:tcMar>
+              <w:top w:type="dxa" w:w="40"/>
+              <w:left w:type="dxa" w:w="80"/>
+              <w:bottom w:type="dxa" w:w="40"/>
+              <w:right w:type="dxa" w:w="80"/>
+            </w:tcMar>
+          </w:tcPr>
+          <w:p>
+            <w:pPr>
+              <w:spacing w:line="240"/>
+            </w:pPr>
+            <w:r>
+              <w:rPr>
+                <w:rFonts w:ascii="Times New Roman" w:cs="Times New Roman" w:eastAsia="Times New Roman" w:hAnsi="Times New Roman"/>
+                <w:i w:val="false"/>
+                <w:iCs w:val="false"/>
+                <w:sz w:val="20"/>
+                <w:szCs w:val="20"/>
+              </w:rPr>
+              <w:t xml:space="preserve">5.01</w:t>
+            </w:r>
+          </w:p>
+        </w:tc>
+      </w:tr>
+      <w:tr>
+        <w:trPr>
+          <w:tblHeader w:val="off"/>
+        </w:trPr>
+        <w:tc>
+          <w:tcPr>
+            <w:tcW w:type="dxa" w:w="1337"/>
+            <w:tcMar>
+              <w:top w:type="dxa" w:w="40"/>
+              <w:left w:type="dxa" w:w="80"/>
+              <w:bottom w:type="dxa" w:w="40"/>
+              <w:right w:type="dxa" w:w="80"/>
+            </w:tcMar>
+          </w:tcPr>
+          <w:p>
+            <w:pPr>
+              <w:spacing w:line="240"/>
+            </w:pPr>
+            <w:r>
+              <w:rPr>
+                <w:rFonts w:ascii="Times New Roman" w:cs="Times New Roman" w:eastAsia="Times New Roman" w:hAnsi="Times New Roman"/>
+                <w:i w:val="false"/>
+                <w:iCs w:val="false"/>
+                <w:sz w:val="20"/>
+                <w:szCs w:val="20"/>
+              </w:rPr>
+              <w:t xml:space="preserve">1.000.000</w:t>
+            </w:r>
+          </w:p>
+        </w:tc>
+        <w:tc>
+          <w:tcPr>
+            <w:tcW w:type="dxa" w:w="1337"/>
+            <w:tcMar>
+              <w:top w:type="dxa" w:w="40"/>
+              <w:left w:type="dxa" w:w="80"/>
+              <w:bottom w:type="dxa" w:w="40"/>
+              <w:right w:type="dxa" w:w="80"/>
+            </w:tcMar>
+          </w:tcPr>
+          <w:p>
+            <w:pPr>
+              <w:spacing w:line="240"/>
+            </w:pPr>
+            <w:r>
+              <w:rPr>
+                <w:rFonts w:ascii="Times New Roman" w:cs="Times New Roman" w:eastAsia="Times New Roman" w:hAnsi="Times New Roman"/>
+                <w:i w:val="false"/>
+                <w:iCs w:val="false"/>
+                <w:sz w:val="20"/>
+                <w:szCs w:val="20"/>
+              </w:rPr>
+              <w:t xml:space="preserve">0.45407 s</w:t>
+            </w:r>
+          </w:p>
+        </w:tc>
+        <w:tc>
+          <w:tcPr>
+            <w:tcW w:type="dxa" w:w="1337"/>
+            <w:tcMar>
+              <w:top w:type="dxa" w:w="40"/>
+              <w:left w:type="dxa" w:w="80"/>
+              <w:bottom w:type="dxa" w:w="40"/>
+              <w:right w:type="dxa" w:w="80"/>
+            </w:tcMar>
+          </w:tcPr>
+          <w:p>
+            <w:pPr>
+              <w:spacing w:line="240"/>
+            </w:pPr>
+            <w:r>
+              <w:rPr>
+                <w:rFonts w:ascii="Times New Roman" w:cs="Times New Roman" w:eastAsia="Times New Roman" w:hAnsi="Times New Roman"/>
+                <w:i w:val="false"/>
+                <w:iCs w:val="false"/>
+                <w:sz w:val="20"/>
+                <w:szCs w:val="20"/>
+              </w:rPr>
+              <w:t xml:space="preserve">1.96</w:t>
+            </w:r>
+          </w:p>
+        </w:tc>
+        <w:tc>
+          <w:tcPr>
+            <w:tcW w:type="dxa" w:w="1337"/>
+            <w:tcMar>
+              <w:top w:type="dxa" w:w="40"/>
+              <w:left w:type="dxa" w:w="80"/>
+              <w:bottom w:type="dxa" w:w="40"/>
+              <w:right w:type="dxa" w:w="80"/>
+            </w:tcMar>
+          </w:tcPr>
+          <w:p>
+            <w:pPr>
+              <w:spacing w:line="240"/>
+            </w:pPr>
+            <w:r>
+              <w:rPr>
+                <w:rFonts w:ascii="Times New Roman" w:cs="Times New Roman" w:eastAsia="Times New Roman" w:hAnsi="Times New Roman"/>
+                <w:i w:val="false"/>
+                <w:iCs w:val="false"/>
+                <w:sz w:val="20"/>
+                <w:szCs w:val="20"/>
+              </w:rPr>
+              <w:t xml:space="preserve">3.84</w:t>
+            </w:r>
+          </w:p>
+        </w:tc>
+        <w:tc>
+          <w:tcPr>
+            <w:tcW w:type="dxa" w:w="1337"/>
+            <w:tcMar>
+              <w:top w:type="dxa" w:w="40"/>
+              <w:left w:type="dxa" w:w="80"/>
+              <w:bottom w:type="dxa" w:w="40"/>
+              <w:right w:type="dxa" w:w="80"/>
+            </w:tcMar>
+          </w:tcPr>
+          <w:p>
+            <w:pPr>
+              <w:spacing w:line="240"/>
+            </w:pPr>
+            <w:r>
+              <w:rPr>
+                <w:rFonts w:ascii="Times New Roman" w:cs="Times New Roman" w:eastAsia="Times New Roman" w:hAnsi="Times New Roman"/>
+                <w:i w:val="false"/>
+                <w:iCs w:val="false"/>
+                <w:sz w:val="20"/>
+                <w:szCs w:val="20"/>
+              </w:rPr>
+              <w:t xml:space="preserve">5.58</w:t>
+            </w:r>
+          </w:p>
+        </w:tc>
+        <w:tc>
+          <w:tcPr>
+            <w:tcW w:type="dxa" w:w="1337"/>
+            <w:tcMar>
+              <w:top w:type="dxa" w:w="40"/>
+              <w:left w:type="dxa" w:w="80"/>
+              <w:bottom w:type="dxa" w:w="40"/>
+              <w:right w:type="dxa" w:w="80"/>
+            </w:tcMar>
+          </w:tcPr>
+          <w:p>
+            <w:pPr>
+              <w:spacing w:line="240"/>
+            </w:pPr>
+            <w:r>
+              <w:rPr>
+                <w:rFonts w:ascii="Times New Roman" w:cs="Times New Roman" w:eastAsia="Times New Roman" w:hAnsi="Times New Roman"/>
+                <w:i w:val="false"/>
+                <w:iCs w:val="false"/>
+                <w:sz w:val="20"/>
+                <w:szCs w:val="20"/>
+              </w:rPr>
+              <w:t xml:space="preserve">5.79</w:t>
+            </w:r>
+          </w:p>
+        </w:tc>
+        <w:tc>
+          <w:tcPr>
+            <w:tcW w:type="dxa" w:w="1338"/>
+            <w:tcMar>
+              <w:top w:type="dxa" w:w="40"/>
+              <w:left w:type="dxa" w:w="80"/>
+              <w:bottom w:type="dxa" w:w="40"/>
+              <w:right w:type="dxa" w:w="80"/>
+            </w:tcMar>
+          </w:tcPr>
+          <w:p>
+            <w:pPr>
+              <w:spacing w:line="240"/>
+            </w:pPr>
+            <w:r>
+              <w:rPr>
+                <w:rFonts w:ascii="Times New Roman" w:cs="Times New Roman" w:eastAsia="Times New Roman" w:hAnsi="Times New Roman"/>
+                <w:i w:val="false"/>
+                <w:iCs w:val="false"/>
+                <w:sz w:val="20"/>
+                <w:szCs w:val="20"/>
+              </w:rPr>
+              <w:t xml:space="preserve">5.98</w:t>
+            </w:r>
+          </w:p>
+        </w:tc>
+      </w:tr>
+    </w:tbl>
+    <w:p>
+      <w:pPr>
+        <w:spacing w:after="240"/>
+      </w:pPr>
+      <w:r>
+        <w:rPr>
+          <w:rFonts w:ascii="Times New Roman" w:cs="Times New Roman" w:eastAsia="Times New Roman" w:hAnsi="Times New Roman"/>
+          <w:sz w:val="24"/>
+          <w:szCs w:val="24"/>
+        </w:rPr>
+        <w:t xml:space="preserve"/>
+      </w:r>
+    </w:p>
+    <w:p>
+      <w:pPr>
+        <w:spacing w:before="240" w:line="240"/>
+      </w:pPr>
+      <w:r>
+        <w:rPr>
+          <w:rFonts w:ascii="Times New Roman" w:cs="Times New Roman" w:eastAsia="Times New Roman" w:hAnsi="Times New Roman"/>
+          <w:b/>
+          <w:bCs/>
+          <w:sz w:val="24"/>
+          <w:szCs w:val="24"/>
+        </w:rPr>
+        <w:t xml:space="preserve">Figura 20</w:t>
+      </w:r>
+    </w:p>
+    <w:p>
+      <w:pPr>
+        <w:spacing w:after="80" w:line="240"/>
+      </w:pPr>
+      <w:r>
+        <w:rPr>
+          <w:rFonts w:ascii="Times New Roman" w:cs="Times New Roman" w:eastAsia="Times New Roman" w:hAnsi="Times New Roman"/>
+          <w:i/>
+          <w:iCs/>
+          <w:sz w:val="24"/>
+          <w:szCs w:val="24"/>
+        </w:rPr>
+        <w:t xml:space="preserve">Speedup según el tamaño del problema</w:t>
+      </w:r>
+    </w:p>
+    <w:p>
+      <w:pPr>
+        <w:spacing w:after="240" w:line="240"/>
+        <w:jc w:val="center"/>
+      </w:pPr>
+      <w:r>
+        <w:drawing>
+          <wp:inline distT="0" distB="0" distL="0" distR="0">
+            <wp:extent cx="5143500" cy="3676650"/>
+            <wp:effectExtent t="0" r="0" b="0" l="0"/>
+            <wp:docPr id="20" name="" descr="" title=""/>
+            <wp:cNvGraphicFramePr>
+              <a:graphicFrameLocks xmlns:a="http://schemas.openxmlformats.org/drawingml/2006/main" noChangeAspect="1"/>
+            </wp:cNvGraphicFramePr>
+            <a:graphic xmlns:a="http://schemas.openxmlformats.org/drawingml/2006/main">
+              <a:graphicData uri="http://schemas.openxmlformats.org/drawingml/2006/picture">
+                <pic:pic xmlns:pic="http://schemas.openxmlformats.org/drawingml/2006/picture">
+                  <pic:nvPicPr>
+                    <pic:cNvPr id="0" name="" descr=""/>
+                    <pic:cNvPicPr>
+                      <a:picLocks noChangeAspect="1" noChangeArrowheads="1"/>
+                    </pic:cNvPicPr>
+                  </pic:nvPicPr>
+                  <pic:blipFill>
+                    <a:blip r:embed="rId26" cstate="none"/>
+                    <a:srcRect/>
+                    <a:stretch>
+                      <a:fillRect/>
+                    </a:stretch>
+                  </pic:blipFill>
+                  <pic:spPr bwMode="auto">
+                    <a:xfrm>
+                      <a:off x="0" y="0"/>
+                      <a:ext cx="5143500" cy="3676650"/>
+                    </a:xfrm>
+                    <a:prstGeom prst="rect">
+                      <a:avLst/>
+                    </a:prstGeom>
+                  </pic:spPr>
+                </pic:pic>
+              </a:graphicData>
+            </a:graphic>
+          </wp:inline>
+        </w:drawing>
+      </w:r>
+    </w:p>
+    <w:p>
+      <w:pPr>
+        <w:spacing w:line="480"/>
+        <w:ind w:firstLine="720"/>
+      </w:pPr>
+      <w:r>
+        <w:rPr>
+          <w:rFonts w:ascii="Times New Roman" w:cs="Times New Roman" w:eastAsia="Times New Roman" w:hAnsi="Times New Roman"/>
+          <w:sz w:val="24"/>
+          <w:szCs w:val="24"/>
+        </w:rPr>
+        <w:t xml:space="preserve">Con pocos procesos el tamaño del problema resulta indiferente: el speedup con dos, cuatro y seis procesos es prácticamente el mismo para mil grupos que para un millón. La diferencia aparece con muchos procesos, donde el speedup mejora sensiblemente al agrandar el problema. Esto ocurre porque existe un costo fijo por corrida (la barrera de sincronización, la reducción final y la puesta en marcha de cada proceso) que no depende de T: cuando el trabajo asignado a cada proceso es pequeño, ese costo representa una fracción considerable del tiempo; cuando es grande, se diluye.</w:t>
+      </w:r>
+    </w:p>
+    <w:p>
+      <w:pPr>
+        <w:spacing w:line="480"/>
+        <w:ind w:firstLine="720"/>
+      </w:pPr>
+      <w:r>
+        <w:rPr>
+          <w:rFonts w:ascii="Times New Roman" w:cs="Times New Roman" w:eastAsia="Times New Roman" w:hAnsi="Times New Roman"/>
+          <w:sz w:val="24"/>
+          <w:szCs w:val="24"/>
+        </w:rPr>
+        <w:t xml:space="preserve">El efecto resulta mucho más contundente al medir el </w:t>
+      </w:r>
+      <w:r>
+        <w:rPr>
+          <w:rFonts w:ascii="Times New Roman" w:cs="Times New Roman" w:eastAsia="Times New Roman" w:hAnsi="Times New Roman"/>
+          <w:b/>
+          <w:bCs/>
+          <w:sz w:val="24"/>
+          <w:szCs w:val="24"/>
+        </w:rPr>
+        <w:t xml:space="preserve">tiempo total del comando</w:t>
+      </w:r>
+      <w:r>
+        <w:rPr>
+          <w:rFonts w:ascii="Times New Roman" w:cs="Times New Roman" w:eastAsia="Times New Roman" w:hAnsi="Times New Roman"/>
+          <w:sz w:val="24"/>
+          <w:szCs w:val="24"/>
+        </w:rPr>
+        <w:t xml:space="preserve">, que incluye la puesta en marcha del entorno MPI (mediana de tres corridas, con ocho procesos):</w:t>
+      </w:r>
+    </w:p>
+    <w:p>
+      <w:pPr>
+        <w:spacing w:before="240" w:line="240"/>
+      </w:pPr>
+      <w:r>
+        <w:rPr>
+          <w:rFonts w:ascii="Times New Roman" w:cs="Times New Roman" w:eastAsia="Times New Roman" w:hAnsi="Times New Roman"/>
+          <w:b/>
+          <w:bCs/>
+          <w:sz w:val="24"/>
+          <w:szCs w:val="24"/>
+        </w:rPr>
+        <w:t xml:space="preserve">Tabla 12</w:t>
+      </w:r>
+    </w:p>
+    <w:p>
+      <w:pPr>
+        <w:spacing w:after="80" w:line="240"/>
+      </w:pPr>
+      <w:r>
+        <w:rPr>
+          <w:rFonts w:ascii="Times New Roman" w:cs="Times New Roman" w:eastAsia="Times New Roman" w:hAnsi="Times New Roman"/>
+          <w:i/>
+          <w:iCs/>
+          <w:sz w:val="24"/>
+          <w:szCs w:val="24"/>
+        </w:rPr>
+        <w:t xml:space="preserve"/>
+      </w:r>
+    </w:p>
+    <w:tbl>
+      <w:tblPr>
+        <w:tblW w:type="dxa" w:w="9360"/>
+        <w:tblBorders>
+          <w:top w:val="single" w:color="000000" w:sz="6"/>
+          <w:left w:val="none" w:color="FFFFFF" w:sz="0"/>
+          <w:bottom w:val="single" w:color="000000" w:sz="6"/>
+          <w:right w:val="none" w:color="FFFFFF" w:sz="0"/>
+          <w:insideH w:val="none" w:color="FFFFFF" w:sz="0"/>
+          <w:insideV w:val="none" w:color="FFFFFF" w:sz="0"/>
+        </w:tblBorders>
+      </w:tblPr>
+      <w:tblGrid>
+        <w:gridCol w:w="2340"/>
+        <w:gridCol w:w="2340"/>
+        <w:gridCol w:w="2340"/>
+        <w:gridCol w:w="2340"/>
+      </w:tblGrid>
+      <w:tr>
+        <w:trPr>
+          <w:tblHeader/>
+        </w:trPr>
+        <w:tc>
+          <w:tcPr>
+            <w:tcW w:type="dxa" w:w="2340"/>
+            <w:tcBorders>
+              <w:bottom w:val="single" w:color="000000" w:sz="6"/>
+            </w:tcBorders>
+            <w:tcMar>
+              <w:top w:type="dxa" w:w="40"/>
+              <w:left w:type="dxa" w:w="80"/>
+              <w:bottom w:type="dxa" w:w="40"/>
+              <w:right w:type="dxa" w:w="80"/>
+            </w:tcMar>
+          </w:tcPr>
+          <w:p>
+            <w:pPr>
+              <w:spacing w:line="240"/>
+            </w:pPr>
+            <w:r>
+              <w:rPr>
+                <w:rFonts w:ascii="Times New Roman" w:cs="Times New Roman" w:eastAsia="Times New Roman" w:hAnsi="Times New Roman"/>
+                <w:i w:val="false"/>
+                <w:iCs w:val="false"/>
+                <w:sz w:val="20"/>
+                <w:szCs w:val="20"/>
+              </w:rPr>
+              <w:t xml:space="preserve">T (grupos)</w:t>
+            </w:r>
+          </w:p>
+        </w:tc>
+        <w:tc>
+          <w:tcPr>
+            <w:tcW w:type="dxa" w:w="2340"/>
+            <w:tcBorders>
+              <w:bottom w:val="single" w:color="000000" w:sz="6"/>
+            </w:tcBorders>
+            <w:tcMar>
+              <w:top w:type="dxa" w:w="40"/>
+              <w:left w:type="dxa" w:w="80"/>
+              <w:bottom w:type="dxa" w:w="40"/>
+              <w:right w:type="dxa" w:w="80"/>
+            </w:tcMar>
+          </w:tcPr>
+          <w:p>
+            <w:pPr>
+              <w:spacing w:line="240"/>
+            </w:pPr>
+            <w:r>
+              <w:rPr>
+                <w:rFonts w:ascii="Times New Roman" w:cs="Times New Roman" w:eastAsia="Times New Roman" w:hAnsi="Times New Roman"/>
+                <w:i w:val="false"/>
+                <w:iCs w:val="false"/>
+                <w:sz w:val="20"/>
+                <w:szCs w:val="20"/>
+              </w:rPr>
+              <w:t xml:space="preserve">Serial</w:t>
+            </w:r>
+          </w:p>
+        </w:tc>
+        <w:tc>
+          <w:tcPr>
+            <w:tcW w:type="dxa" w:w="2340"/>
+            <w:tcBorders>
+              <w:bottom w:val="single" w:color="000000" w:sz="6"/>
+            </w:tcBorders>
+            <w:tcMar>
+              <w:top w:type="dxa" w:w="40"/>
+              <w:left w:type="dxa" w:w="80"/>
+              <w:bottom w:type="dxa" w:w="40"/>
+              <w:right w:type="dxa" w:w="80"/>
+            </w:tcMar>
+          </w:tcPr>
+          <w:p>
+            <w:pPr>
+              <w:spacing w:line="240"/>
+            </w:pPr>
+            <w:r>
+              <w:rPr>
+                <w:rFonts w:ascii="Times New Roman" w:cs="Times New Roman" w:eastAsia="Times New Roman" w:hAnsi="Times New Roman"/>
+                <w:i w:val="false"/>
+                <w:iCs w:val="false"/>
+                <w:sz w:val="20"/>
+                <w:szCs w:val="20"/>
+              </w:rPr>
+              <w:t xml:space="preserve">8 procesos</w:t>
+            </w:r>
+          </w:p>
+        </w:tc>
+        <w:tc>
+          <w:tcPr>
+            <w:tcW w:type="dxa" w:w="2340"/>
+            <w:tcBorders>
+              <w:bottom w:val="single" w:color="000000" w:sz="6"/>
+            </w:tcBorders>
+            <w:tcMar>
+              <w:top w:type="dxa" w:w="40"/>
+              <w:left w:type="dxa" w:w="80"/>
+              <w:bottom w:type="dxa" w:w="40"/>
+              <w:right w:type="dxa" w:w="80"/>
+            </w:tcMar>
+          </w:tcPr>
+          <w:p>
+            <w:pPr>
+              <w:spacing w:line="240"/>
+            </w:pPr>
+            <w:r>
+              <w:rPr>
+                <w:rFonts w:ascii="Times New Roman" w:cs="Times New Roman" w:eastAsia="Times New Roman" w:hAnsi="Times New Roman"/>
+                <w:i w:val="false"/>
+                <w:iCs w:val="false"/>
+                <w:sz w:val="20"/>
+                <w:szCs w:val="20"/>
+              </w:rPr>
+              <w:t xml:space="preserve">Ganancia real</w:t>
+            </w:r>
+          </w:p>
+        </w:tc>
+      </w:tr>
+      <w:tr>
+        <w:trPr>
+          <w:tblHeader w:val="off"/>
+        </w:trPr>
+        <w:tc>
+          <w:tcPr>
+            <w:tcW w:type="dxa" w:w="2340"/>
+            <w:tcMar>
+              <w:top w:type="dxa" w:w="40"/>
+              <w:left w:type="dxa" w:w="80"/>
+              <w:bottom w:type="dxa" w:w="40"/>
+              <w:right w:type="dxa" w:w="80"/>
+            </w:tcMar>
+          </w:tcPr>
+          <w:p>
+            <w:pPr>
+              <w:spacing w:line="240"/>
+            </w:pPr>
+            <w:r>
+              <w:rPr>
+                <w:rFonts w:ascii="Times New Roman" w:cs="Times New Roman" w:eastAsia="Times New Roman" w:hAnsi="Times New Roman"/>
+                <w:i w:val="false"/>
+                <w:iCs w:val="false"/>
+                <w:sz w:val="20"/>
+                <w:szCs w:val="20"/>
+              </w:rPr>
+              <w:t xml:space="preserve">1.000</w:t>
+            </w:r>
+          </w:p>
+        </w:tc>
+        <w:tc>
+          <w:tcPr>
+            <w:tcW w:type="dxa" w:w="2340"/>
+            <w:tcMar>
+              <w:top w:type="dxa" w:w="40"/>
+              <w:left w:type="dxa" w:w="80"/>
+              <w:bottom w:type="dxa" w:w="40"/>
+              <w:right w:type="dxa" w:w="80"/>
+            </w:tcMar>
+          </w:tcPr>
+          <w:p>
+            <w:pPr>
+              <w:spacing w:line="240"/>
+            </w:pPr>
+            <w:r>
+              <w:rPr>
+                <w:rFonts w:ascii="Times New Roman" w:cs="Times New Roman" w:eastAsia="Times New Roman" w:hAnsi="Times New Roman"/>
+                <w:i w:val="false"/>
+                <w:iCs w:val="false"/>
+                <w:sz w:val="20"/>
+                <w:szCs w:val="20"/>
+              </w:rPr>
+              <w:t xml:space="preserve">0.08 s</w:t>
+            </w:r>
+          </w:p>
+        </w:tc>
+        <w:tc>
+          <w:tcPr>
+            <w:tcW w:type="dxa" w:w="2340"/>
+            <w:tcMar>
+              <w:top w:type="dxa" w:w="40"/>
+              <w:left w:type="dxa" w:w="80"/>
+              <w:bottom w:type="dxa" w:w="40"/>
+              <w:right w:type="dxa" w:w="80"/>
+            </w:tcMar>
+          </w:tcPr>
+          <w:p>
+            <w:pPr>
+              <w:spacing w:line="240"/>
+            </w:pPr>
+            <w:r>
+              <w:rPr>
+                <w:rFonts w:ascii="Times New Roman" w:cs="Times New Roman" w:eastAsia="Times New Roman" w:hAnsi="Times New Roman"/>
+                <w:i w:val="false"/>
+                <w:iCs w:val="false"/>
+                <w:sz w:val="20"/>
+                <w:szCs w:val="20"/>
+              </w:rPr>
+              <w:t xml:space="preserve">0.09 s</w:t>
+            </w:r>
+          </w:p>
+        </w:tc>
+        <w:tc>
+          <w:tcPr>
+            <w:tcW w:type="dxa" w:w="2340"/>
+            <w:tcMar>
+              <w:top w:type="dxa" w:w="40"/>
+              <w:left w:type="dxa" w:w="80"/>
+              <w:bottom w:type="dxa" w:w="40"/>
+              <w:right w:type="dxa" w:w="80"/>
+            </w:tcMar>
+          </w:tcPr>
+          <w:p>
+            <w:pPr>
+              <w:spacing w:line="240"/>
+            </w:pPr>
+            <w:r>
+              <w:rPr>
+                <w:rFonts w:ascii="Times New Roman" w:cs="Times New Roman" w:eastAsia="Times New Roman" w:hAnsi="Times New Roman"/>
+                <w:i w:val="false"/>
+                <w:iCs w:val="false"/>
+                <w:sz w:val="20"/>
+                <w:szCs w:val="20"/>
+              </w:rPr>
+              <w:t xml:space="preserve">0.89×</w:t>
+            </w:r>
+          </w:p>
+        </w:tc>
+      </w:tr>
+      <w:tr>
+        <w:trPr>
+          <w:tblHeader w:val="off"/>
+        </w:trPr>
+        <w:tc>
+          <w:tcPr>
+            <w:tcW w:type="dxa" w:w="2340"/>
+            <w:tcMar>
+              <w:top w:type="dxa" w:w="40"/>
+              <w:left w:type="dxa" w:w="80"/>
+              <w:bottom w:type="dxa" w:w="40"/>
+              <w:right w:type="dxa" w:w="80"/>
+            </w:tcMar>
+          </w:tcPr>
+          <w:p>
+            <w:pPr>
+              <w:spacing w:line="240"/>
+            </w:pPr>
+            <w:r>
+              <w:rPr>
+                <w:rFonts w:ascii="Times New Roman" w:cs="Times New Roman" w:eastAsia="Times New Roman" w:hAnsi="Times New Roman"/>
+                <w:i w:val="false"/>
+                <w:iCs w:val="false"/>
+                <w:sz w:val="20"/>
+                <w:szCs w:val="20"/>
+              </w:rPr>
+              <w:t xml:space="preserve">10.000</w:t>
+            </w:r>
+          </w:p>
+        </w:tc>
+        <w:tc>
+          <w:tcPr>
+            <w:tcW w:type="dxa" w:w="2340"/>
+            <w:tcMar>
+              <w:top w:type="dxa" w:w="40"/>
+              <w:left w:type="dxa" w:w="80"/>
+              <w:bottom w:type="dxa" w:w="40"/>
+              <w:right w:type="dxa" w:w="80"/>
+            </w:tcMar>
+          </w:tcPr>
+          <w:p>
+            <w:pPr>
+              <w:spacing w:line="240"/>
+            </w:pPr>
+            <w:r>
+              <w:rPr>
+                <w:rFonts w:ascii="Times New Roman" w:cs="Times New Roman" w:eastAsia="Times New Roman" w:hAnsi="Times New Roman"/>
+                <w:i w:val="false"/>
+                <w:iCs w:val="false"/>
+                <w:sz w:val="20"/>
+                <w:szCs w:val="20"/>
+              </w:rPr>
+              <w:t xml:space="preserve">0.07 s</w:t>
+            </w:r>
+          </w:p>
+        </w:tc>
+        <w:tc>
+          <w:tcPr>
+            <w:tcW w:type="dxa" w:w="2340"/>
+            <w:tcMar>
+              <w:top w:type="dxa" w:w="40"/>
+              <w:left w:type="dxa" w:w="80"/>
+              <w:bottom w:type="dxa" w:w="40"/>
+              <w:right w:type="dxa" w:w="80"/>
+            </w:tcMar>
+          </w:tcPr>
+          <w:p>
+            <w:pPr>
+              <w:spacing w:line="240"/>
+            </w:pPr>
+            <w:r>
+              <w:rPr>
+                <w:rFonts w:ascii="Times New Roman" w:cs="Times New Roman" w:eastAsia="Times New Roman" w:hAnsi="Times New Roman"/>
+                <w:i w:val="false"/>
+                <w:iCs w:val="false"/>
+                <w:sz w:val="20"/>
+                <w:szCs w:val="20"/>
+              </w:rPr>
+              <w:t xml:space="preserve">0.10 s</w:t>
+            </w:r>
+          </w:p>
+        </w:tc>
+        <w:tc>
+          <w:tcPr>
+            <w:tcW w:type="dxa" w:w="2340"/>
+            <w:tcMar>
+              <w:top w:type="dxa" w:w="40"/>
+              <w:left w:type="dxa" w:w="80"/>
+              <w:bottom w:type="dxa" w:w="40"/>
+              <w:right w:type="dxa" w:w="80"/>
+            </w:tcMar>
+          </w:tcPr>
+          <w:p>
+            <w:pPr>
+              <w:spacing w:line="240"/>
+            </w:pPr>
+            <w:r>
+              <w:rPr>
+                <w:rFonts w:ascii="Times New Roman" w:cs="Times New Roman" w:eastAsia="Times New Roman" w:hAnsi="Times New Roman"/>
+                <w:i w:val="false"/>
+                <w:iCs w:val="false"/>
+                <w:sz w:val="20"/>
+                <w:szCs w:val="20"/>
+              </w:rPr>
+              <w:t xml:space="preserve">0.70×</w:t>
+            </w:r>
+          </w:p>
+        </w:tc>
+      </w:tr>
+      <w:tr>
+        <w:trPr>
+          <w:tblHeader w:val="off"/>
+        </w:trPr>
+        <w:tc>
+          <w:tcPr>
+            <w:tcW w:type="dxa" w:w="2340"/>
+            <w:tcMar>
+              <w:top w:type="dxa" w:w="40"/>
+              <w:left w:type="dxa" w:w="80"/>
+              <w:bottom w:type="dxa" w:w="40"/>
+              <w:right w:type="dxa" w:w="80"/>
+            </w:tcMar>
+          </w:tcPr>
+          <w:p>
+            <w:pPr>
+              <w:spacing w:line="240"/>
+            </w:pPr>
+            <w:r>
+              <w:rPr>
+                <w:rFonts w:ascii="Times New Roman" w:cs="Times New Roman" w:eastAsia="Times New Roman" w:hAnsi="Times New Roman"/>
+                <w:i w:val="false"/>
+                <w:iCs w:val="false"/>
+                <w:sz w:val="20"/>
+                <w:szCs w:val="20"/>
+              </w:rPr>
+              <w:t xml:space="preserve">100.000</w:t>
+            </w:r>
+          </w:p>
+        </w:tc>
+        <w:tc>
+          <w:tcPr>
+            <w:tcW w:type="dxa" w:w="2340"/>
+            <w:tcMar>
+              <w:top w:type="dxa" w:w="40"/>
+              <w:left w:type="dxa" w:w="80"/>
+              <w:bottom w:type="dxa" w:w="40"/>
+              <w:right w:type="dxa" w:w="80"/>
+            </w:tcMar>
+          </w:tcPr>
+          <w:p>
+            <w:pPr>
+              <w:spacing w:line="240"/>
+            </w:pPr>
+            <w:r>
+              <w:rPr>
+                <w:rFonts w:ascii="Times New Roman" w:cs="Times New Roman" w:eastAsia="Times New Roman" w:hAnsi="Times New Roman"/>
+                <w:i w:val="false"/>
+                <w:iCs w:val="false"/>
+                <w:sz w:val="20"/>
+                <w:szCs w:val="20"/>
+              </w:rPr>
+              <w:t xml:space="preserve">0.11 s</w:t>
+            </w:r>
+          </w:p>
+        </w:tc>
+        <w:tc>
+          <w:tcPr>
+            <w:tcW w:type="dxa" w:w="2340"/>
+            <w:tcMar>
+              <w:top w:type="dxa" w:w="40"/>
+              <w:left w:type="dxa" w:w="80"/>
+              <w:bottom w:type="dxa" w:w="40"/>
+              <w:right w:type="dxa" w:w="80"/>
+            </w:tcMar>
+          </w:tcPr>
+          <w:p>
+            <w:pPr>
+              <w:spacing w:line="240"/>
+            </w:pPr>
+            <w:r>
+              <w:rPr>
+                <w:rFonts w:ascii="Times New Roman" w:cs="Times New Roman" w:eastAsia="Times New Roman" w:hAnsi="Times New Roman"/>
+                <w:i w:val="false"/>
+                <w:iCs w:val="false"/>
+                <w:sz w:val="20"/>
+                <w:szCs w:val="20"/>
+              </w:rPr>
+              <w:t xml:space="preserve">0.11 s</w:t>
+            </w:r>
+          </w:p>
+        </w:tc>
+        <w:tc>
+          <w:tcPr>
+            <w:tcW w:type="dxa" w:w="2340"/>
+            <w:tcMar>
+              <w:top w:type="dxa" w:w="40"/>
+              <w:left w:type="dxa" w:w="80"/>
+              <w:bottom w:type="dxa" w:w="40"/>
+              <w:right w:type="dxa" w:w="80"/>
+            </w:tcMar>
+          </w:tcPr>
+          <w:p>
+            <w:pPr>
+              <w:spacing w:line="240"/>
+            </w:pPr>
+            <w:r>
+              <w:rPr>
+                <w:rFonts w:ascii="Times New Roman" w:cs="Times New Roman" w:eastAsia="Times New Roman" w:hAnsi="Times New Roman"/>
+                <w:i w:val="false"/>
+                <w:iCs w:val="false"/>
+                <w:sz w:val="20"/>
+                <w:szCs w:val="20"/>
+              </w:rPr>
+              <w:t xml:space="preserve">1.00×</w:t>
+            </w:r>
+          </w:p>
+        </w:tc>
+      </w:tr>
+      <w:tr>
+        <w:trPr>
+          <w:tblHeader w:val="off"/>
+        </w:trPr>
+        <w:tc>
+          <w:tcPr>
+            <w:tcW w:type="dxa" w:w="2340"/>
+            <w:tcMar>
+              <w:top w:type="dxa" w:w="40"/>
+              <w:left w:type="dxa" w:w="80"/>
+              <w:bottom w:type="dxa" w:w="40"/>
+              <w:right w:type="dxa" w:w="80"/>
+            </w:tcMar>
+          </w:tcPr>
+          <w:p>
+            <w:pPr>
+              <w:spacing w:line="240"/>
+            </w:pPr>
+            <w:r>
+              <w:rPr>
+                <w:rFonts w:ascii="Times New Roman" w:cs="Times New Roman" w:eastAsia="Times New Roman" w:hAnsi="Times New Roman"/>
+                <w:i w:val="false"/>
+                <w:iCs w:val="false"/>
+                <w:sz w:val="20"/>
+                <w:szCs w:val="20"/>
+              </w:rPr>
+              <w:t xml:space="preserve">1.000.000</w:t>
+            </w:r>
+          </w:p>
+        </w:tc>
+        <w:tc>
+          <w:tcPr>
+            <w:tcW w:type="dxa" w:w="2340"/>
+            <w:tcMar>
+              <w:top w:type="dxa" w:w="40"/>
+              <w:left w:type="dxa" w:w="80"/>
+              <w:bottom w:type="dxa" w:w="40"/>
+              <w:right w:type="dxa" w:w="80"/>
+            </w:tcMar>
+          </w:tcPr>
+          <w:p>
+            <w:pPr>
+              <w:spacing w:line="240"/>
+            </w:pPr>
+            <w:r>
+              <w:rPr>
+                <w:rFonts w:ascii="Times New Roman" w:cs="Times New Roman" w:eastAsia="Times New Roman" w:hAnsi="Times New Roman"/>
+                <w:i w:val="false"/>
+                <w:iCs w:val="false"/>
+                <w:sz w:val="20"/>
+                <w:szCs w:val="20"/>
+              </w:rPr>
+              <w:t xml:space="preserve">0.52 s</w:t>
+            </w:r>
+          </w:p>
+        </w:tc>
+        <w:tc>
+          <w:tcPr>
+            <w:tcW w:type="dxa" w:w="2340"/>
+            <w:tcMar>
+              <w:top w:type="dxa" w:w="40"/>
+              <w:left w:type="dxa" w:w="80"/>
+              <w:bottom w:type="dxa" w:w="40"/>
+              <w:right w:type="dxa" w:w="80"/>
+            </w:tcMar>
+          </w:tcPr>
+          <w:p>
+            <w:pPr>
+              <w:spacing w:line="240"/>
+            </w:pPr>
+            <w:r>
+              <w:rPr>
+                <w:rFonts w:ascii="Times New Roman" w:cs="Times New Roman" w:eastAsia="Times New Roman" w:hAnsi="Times New Roman"/>
+                <w:i w:val="false"/>
+                <w:iCs w:val="false"/>
+                <w:sz w:val="20"/>
+                <w:szCs w:val="20"/>
+              </w:rPr>
+              <w:t xml:space="preserve">0.18 s</w:t>
+            </w:r>
+          </w:p>
+        </w:tc>
+        <w:tc>
+          <w:tcPr>
+            <w:tcW w:type="dxa" w:w="2340"/>
+            <w:tcMar>
+              <w:top w:type="dxa" w:w="40"/>
+              <w:left w:type="dxa" w:w="80"/>
+              <w:bottom w:type="dxa" w:w="40"/>
+              <w:right w:type="dxa" w:w="80"/>
+            </w:tcMar>
+          </w:tcPr>
+          <w:p>
+            <w:pPr>
+              <w:spacing w:line="240"/>
+            </w:pPr>
+            <w:r>
+              <w:rPr>
+                <w:rFonts w:ascii="Times New Roman" w:cs="Times New Roman" w:eastAsia="Times New Roman" w:hAnsi="Times New Roman"/>
+                <w:i w:val="false"/>
+                <w:iCs w:val="false"/>
+                <w:sz w:val="20"/>
+                <w:szCs w:val="20"/>
+              </w:rPr>
+              <w:t xml:space="preserve">2.89×</w:t>
+            </w:r>
+          </w:p>
+        </w:tc>
+      </w:tr>
+      <w:tr>
+        <w:trPr>
+          <w:tblHeader w:val="off"/>
+        </w:trPr>
+        <w:tc>
+          <w:tcPr>
+            <w:tcW w:type="dxa" w:w="2340"/>
+            <w:tcMar>
+              <w:top w:type="dxa" w:w="40"/>
+              <w:left w:type="dxa" w:w="80"/>
+              <w:bottom w:type="dxa" w:w="40"/>
+              <w:right w:type="dxa" w:w="80"/>
+            </w:tcMar>
+          </w:tcPr>
+          <w:p>
+            <w:pPr>
+              <w:spacing w:line="240"/>
+            </w:pPr>
+            <w:r>
+              <w:rPr>
+                <w:rFonts w:ascii="Times New Roman" w:cs="Times New Roman" w:eastAsia="Times New Roman" w:hAnsi="Times New Roman"/>
+                <w:i w:val="false"/>
+                <w:iCs w:val="false"/>
+                <w:sz w:val="20"/>
+                <w:szCs w:val="20"/>
+              </w:rPr>
+              <w:t xml:space="preserve">10.000.000</w:t>
+            </w:r>
+          </w:p>
+        </w:tc>
+        <w:tc>
+          <w:tcPr>
+            <w:tcW w:type="dxa" w:w="2340"/>
+            <w:tcMar>
+              <w:top w:type="dxa" w:w="40"/>
+              <w:left w:type="dxa" w:w="80"/>
+              <w:bottom w:type="dxa" w:w="40"/>
+              <w:right w:type="dxa" w:w="80"/>
+            </w:tcMar>
+          </w:tcPr>
+          <w:p>
+            <w:pPr>
+              <w:spacing w:line="240"/>
+            </w:pPr>
+            <w:r>
+              <w:rPr>
+                <w:rFonts w:ascii="Times New Roman" w:cs="Times New Roman" w:eastAsia="Times New Roman" w:hAnsi="Times New Roman"/>
+                <w:i w:val="false"/>
+                <w:iCs w:val="false"/>
+                <w:sz w:val="20"/>
+                <w:szCs w:val="20"/>
+              </w:rPr>
+              <w:t xml:space="preserve">4.61 s</w:t>
+            </w:r>
+          </w:p>
+        </w:tc>
+        <w:tc>
+          <w:tcPr>
+            <w:tcW w:type="dxa" w:w="2340"/>
+            <w:tcMar>
+              <w:top w:type="dxa" w:w="40"/>
+              <w:left w:type="dxa" w:w="80"/>
+              <w:bottom w:type="dxa" w:w="40"/>
+              <w:right w:type="dxa" w:w="80"/>
+            </w:tcMar>
+          </w:tcPr>
+          <w:p>
+            <w:pPr>
+              <w:spacing w:line="240"/>
+            </w:pPr>
+            <w:r>
+              <w:rPr>
+                <w:rFonts w:ascii="Times New Roman" w:cs="Times New Roman" w:eastAsia="Times New Roman" w:hAnsi="Times New Roman"/>
+                <w:i w:val="false"/>
+                <w:iCs w:val="false"/>
+                <w:sz w:val="20"/>
+                <w:szCs w:val="20"/>
+              </w:rPr>
+              <w:t xml:space="preserve">0.85 s</w:t>
+            </w:r>
+          </w:p>
+        </w:tc>
+        <w:tc>
+          <w:tcPr>
+            <w:tcW w:type="dxa" w:w="2340"/>
+            <w:tcMar>
+              <w:top w:type="dxa" w:w="40"/>
+              <w:left w:type="dxa" w:w="80"/>
+              <w:bottom w:type="dxa" w:w="40"/>
+              <w:right w:type="dxa" w:w="80"/>
+            </w:tcMar>
+          </w:tcPr>
+          <w:p>
+            <w:pPr>
+              <w:spacing w:line="240"/>
+            </w:pPr>
+            <w:r>
+              <w:rPr>
+                <w:rFonts w:ascii="Times New Roman" w:cs="Times New Roman" w:eastAsia="Times New Roman" w:hAnsi="Times New Roman"/>
+                <w:i w:val="false"/>
+                <w:iCs w:val="false"/>
+                <w:sz w:val="20"/>
+                <w:szCs w:val="20"/>
+              </w:rPr>
+              <w:t xml:space="preserve">5.42×</w:t>
+            </w:r>
+          </w:p>
+        </w:tc>
+      </w:tr>
+    </w:tbl>
+    <w:p>
+      <w:pPr>
+        <w:spacing w:after="240"/>
+      </w:pPr>
+      <w:r>
+        <w:rPr>
+          <w:rFonts w:ascii="Times New Roman" w:cs="Times New Roman" w:eastAsia="Times New Roman" w:hAnsi="Times New Roman"/>
+          <w:sz w:val="24"/>
+          <w:szCs w:val="24"/>
+        </w:rPr>
+        <w:t xml:space="preserve"/>
+      </w:r>
+    </w:p>
+    <w:p>
+      <w:pPr>
+        <w:spacing w:before="240" w:line="240"/>
+      </w:pPr>
+      <w:r>
+        <w:rPr>
+          <w:rFonts w:ascii="Times New Roman" w:cs="Times New Roman" w:eastAsia="Times New Roman" w:hAnsi="Times New Roman"/>
+          <w:b/>
+          <w:bCs/>
+          <w:sz w:val="24"/>
+          <w:szCs w:val="24"/>
+        </w:rPr>
+        <w:t xml:space="preserve">Figura 21</w:t>
+      </w:r>
+    </w:p>
+    <w:p>
+      <w:pPr>
+        <w:spacing w:after="80" w:line="240"/>
+      </w:pPr>
+      <w:r>
+        <w:rPr>
+          <w:rFonts w:ascii="Times New Roman" w:cs="Times New Roman" w:eastAsia="Times New Roman" w:hAnsi="Times New Roman"/>
+          <w:i/>
+          <w:iCs/>
+          <w:sz w:val="24"/>
+          <w:szCs w:val="24"/>
+        </w:rPr>
+        <w:t xml:space="preserve">Ganancia real incluyendo el arranque de MPI</w:t>
+      </w:r>
+    </w:p>
+    <w:p>
+      <w:pPr>
+        <w:spacing w:after="240" w:line="240"/>
+        <w:jc w:val="center"/>
+      </w:pPr>
+      <w:r>
+        <w:drawing>
+          <wp:inline distT="0" distB="0" distL="0" distR="0">
+            <wp:extent cx="5143500" cy="3676650"/>
+            <wp:effectExtent t="0" r="0" b="0" l="0"/>
+            <wp:docPr id="21" name="" descr="" title=""/>
+            <wp:cNvGraphicFramePr>
+              <a:graphicFrameLocks xmlns:a="http://schemas.openxmlformats.org/drawingml/2006/main" noChangeAspect="1"/>
+            </wp:cNvGraphicFramePr>
+            <a:graphic xmlns:a="http://schemas.openxmlformats.org/drawingml/2006/main">
+              <a:graphicData uri="http://schemas.openxmlformats.org/drawingml/2006/picture">
+                <pic:pic xmlns:pic="http://schemas.openxmlformats.org/drawingml/2006/picture">
+                  <pic:nvPicPr>
+                    <pic:cNvPr id="0" name="" descr=""/>
+                    <pic:cNvPicPr>
+                      <a:picLocks noChangeAspect="1" noChangeArrowheads="1"/>
+                    </pic:cNvPicPr>
+                  </pic:nvPicPr>
+                  <pic:blipFill>
+                    <a:blip r:embed="rId27" cstate="none"/>
+                    <a:srcRect/>
+                    <a:stretch>
+                      <a:fillRect/>
+                    </a:stretch>
+                  </pic:blipFill>
+                  <pic:spPr bwMode="auto">
+                    <a:xfrm>
+                      <a:off x="0" y="0"/>
+                      <a:ext cx="5143500" cy="3676650"/>
+                    </a:xfrm>
+                    <a:prstGeom prst="rect">
+                      <a:avLst/>
+                    </a:prstGeom>
+                  </pic:spPr>
+                </pic:pic>
+              </a:graphicData>
+            </a:graphic>
+          </wp:inline>
+        </w:drawing>
+      </w:r>
+    </w:p>
+    <w:p>
+      <w:pPr>
+        <w:spacing w:line="480"/>
+        <w:ind w:firstLine="720"/>
+      </w:pPr>
+      <w:r>
+        <w:rPr>
+          <w:rFonts w:ascii="Times New Roman" w:cs="Times New Roman" w:eastAsia="Times New Roman" w:hAnsi="Times New Roman"/>
+          <w:sz w:val="24"/>
+          <w:szCs w:val="24"/>
+        </w:rPr>
+        <w:t xml:space="preserve">Con problemas pequeños </w:t>
+      </w:r>
+      <w:r>
+        <w:rPr>
+          <w:rFonts w:ascii="Times New Roman" w:cs="Times New Roman" w:eastAsia="Times New Roman" w:hAnsi="Times New Roman"/>
+          <w:b/>
+          <w:bCs/>
+          <w:sz w:val="24"/>
+          <w:szCs w:val="24"/>
+        </w:rPr>
+        <w:t xml:space="preserve">la versión paralela es más lenta que la serial</w:t>
+      </w:r>
+      <w:r>
+        <w:rPr>
+          <w:rFonts w:ascii="Times New Roman" w:cs="Times New Roman" w:eastAsia="Times New Roman" w:hAnsi="Times New Roman"/>
+          <w:sz w:val="24"/>
+          <w:szCs w:val="24"/>
+        </w:rPr>
+        <w:t xml:space="preserve">: la ganancia cae por debajo de 1 porque lanzar ocho procesos cuesta más que simular los grupos. Recién a partir del millón de grupos la paralelización empieza a rendir, y con diez millones alcanza una ganancia real superior a cinco veces. El paralelismo solo resulta rentable cuando el trabajo asignado a cada proceso supera ampliamente el costo de ponerlos en marcha y coordinarlos.</w:t>
+      </w:r>
+    </w:p>
+    <w:p>
+      <w:pPr>
+        <w:spacing w:line="480"/>
+        <w:ind w:firstLine="720"/>
+      </w:pPr>
+      <w:r>
+        <w:rPr>
+          <w:rFonts w:ascii="Times New Roman" w:cs="Times New Roman" w:eastAsia="Times New Roman" w:hAnsi="Times New Roman"/>
+          <w:sz w:val="24"/>
+          <w:szCs w:val="24"/>
+        </w:rPr>
+        <w:t xml:space="preserve">Este comportamiento es una manifestación directa de la </w:t>
+      </w:r>
+      <w:r>
+        <w:rPr>
+          <w:rFonts w:ascii="Times New Roman" w:cs="Times New Roman" w:eastAsia="Times New Roman" w:hAnsi="Times New Roman"/>
+          <w:b/>
+          <w:bCs/>
+          <w:sz w:val="24"/>
+          <w:szCs w:val="24"/>
+        </w:rPr>
+        <w:t xml:space="preserve">ley de Amdahl</w:t>
+      </w:r>
+      <w:r>
+        <w:rPr>
+          <w:rFonts w:ascii="Times New Roman" w:cs="Times New Roman" w:eastAsia="Times New Roman" w:hAnsi="Times New Roman"/>
+          <w:sz w:val="24"/>
+          <w:szCs w:val="24"/>
+        </w:rPr>
+        <w:t xml:space="preserve">: la porción no paralelizable del programa (inicialización, sincronización y reducción) es aproximadamente constante, de modo que su peso relativo disminuye a medida que crece la parte paralelizable.</w:t>
+      </w:r>
+    </w:p>
+    <w:p>
+      <w:pPr>
+        <w:pStyle w:val="Heading3"/>
+        <w:spacing w:line="480"/>
+        <w:jc w:val="left"/>
+      </w:pPr>
+      <w:r>
+        <w:rPr>
+          <w:rFonts w:ascii="Times New Roman" w:cs="Times New Roman" w:eastAsia="Times New Roman" w:hAnsi="Times New Roman"/>
+          <w:b/>
+          <w:bCs/>
+          <w:i/>
+          <w:iCs/>
+          <w:sz w:val="24"/>
+          <w:szCs w:val="24"/>
+        </w:rPr>
+        <w:t xml:space="preserve">Variación del tamaño del grupo (K)</w:t>
+      </w:r>
+    </w:p>
+    <w:p>
+      <w:pPr>
+        <w:spacing w:line="480"/>
+        <w:ind w:firstLine="720"/>
+      </w:pPr>
+      <w:r>
+        <w:rPr>
+          <w:rFonts w:ascii="Times New Roman" w:cs="Times New Roman" w:eastAsia="Times New Roman" w:hAnsi="Times New Roman"/>
+          <w:sz w:val="24"/>
+          <w:szCs w:val="24"/>
+        </w:rPr>
+        <w:t xml:space="preserve">Medición con T=1.000.000 fijo y mediana de cinco corridas:</w:t>
+      </w:r>
+    </w:p>
+    <w:p>
+      <w:pPr>
+        <w:spacing w:before="240" w:line="240"/>
+      </w:pPr>
+      <w:r>
+        <w:rPr>
+          <w:rFonts w:ascii="Times New Roman" w:cs="Times New Roman" w:eastAsia="Times New Roman" w:hAnsi="Times New Roman"/>
+          <w:b/>
+          <w:bCs/>
+          <w:sz w:val="24"/>
+          <w:szCs w:val="24"/>
+        </w:rPr>
+        <w:t xml:space="preserve">Tabla 13</w:t>
+      </w:r>
+    </w:p>
+    <w:p>
+      <w:pPr>
+        <w:spacing w:after="80" w:line="240"/>
+      </w:pPr>
+      <w:r>
+        <w:rPr>
+          <w:rFonts w:ascii="Times New Roman" w:cs="Times New Roman" w:eastAsia="Times New Roman" w:hAnsi="Times New Roman"/>
+          <w:i/>
+          <w:iCs/>
+          <w:sz w:val="24"/>
+          <w:szCs w:val="24"/>
+        </w:rPr>
+        <w:t xml:space="preserve"/>
+      </w:r>
+    </w:p>
+    <w:tbl>
+      <w:tblPr>
+        <w:tblW w:type="dxa" w:w="9360"/>
+        <w:tblBorders>
+          <w:top w:val="single" w:color="000000" w:sz="6"/>
+          <w:left w:val="none" w:color="FFFFFF" w:sz="0"/>
+          <w:bottom w:val="single" w:color="000000" w:sz="6"/>
+          <w:right w:val="none" w:color="FFFFFF" w:sz="0"/>
+          <w:insideH w:val="none" w:color="FFFFFF" w:sz="0"/>
+          <w:insideV w:val="none" w:color="FFFFFF" w:sz="0"/>
+        </w:tblBorders>
+      </w:tblPr>
+      <w:tblGrid>
+        <w:gridCol w:w="2340"/>
+        <w:gridCol w:w="2340"/>
+        <w:gridCol w:w="2340"/>
+        <w:gridCol w:w="2340"/>
+      </w:tblGrid>
+      <w:tr>
+        <w:trPr>
+          <w:tblHeader/>
+        </w:trPr>
+        <w:tc>
+          <w:tcPr>
+            <w:tcW w:type="dxa" w:w="2340"/>
+            <w:tcBorders>
+              <w:bottom w:val="single" w:color="000000" w:sz="6"/>
+            </w:tcBorders>
+            <w:tcMar>
+              <w:top w:type="dxa" w:w="40"/>
+              <w:left w:type="dxa" w:w="80"/>
+              <w:bottom w:type="dxa" w:w="40"/>
+              <w:right w:type="dxa" w:w="80"/>
+            </w:tcMar>
+          </w:tcPr>
+          <w:p>
+            <w:pPr>
+              <w:spacing w:line="240"/>
+            </w:pPr>
+            <w:r>
+              <w:rPr>
+                <w:rFonts w:ascii="Times New Roman" w:cs="Times New Roman" w:eastAsia="Times New Roman" w:hAnsi="Times New Roman"/>
+                <w:i w:val="false"/>
+                <w:iCs w:val="false"/>
+                <w:sz w:val="20"/>
+                <w:szCs w:val="20"/>
+              </w:rPr>
+              <w:t xml:space="preserve">K (personas)</w:t>
+            </w:r>
+          </w:p>
+        </w:tc>
+        <w:tc>
+          <w:tcPr>
+            <w:tcW w:type="dxa" w:w="2340"/>
+            <w:tcBorders>
+              <w:bottom w:val="single" w:color="000000" w:sz="6"/>
+            </w:tcBorders>
+            <w:tcMar>
+              <w:top w:type="dxa" w:w="40"/>
+              <w:left w:type="dxa" w:w="80"/>
+              <w:bottom w:type="dxa" w:w="40"/>
+              <w:right w:type="dxa" w:w="80"/>
+            </w:tcMar>
+          </w:tcPr>
+          <w:p>
+            <w:pPr>
+              <w:spacing w:line="240"/>
+            </w:pPr>
+            <w:r>
+              <w:rPr>
+                <w:rFonts w:ascii="Times New Roman" w:cs="Times New Roman" w:eastAsia="Times New Roman" w:hAnsi="Times New Roman"/>
+                <w:i w:val="false"/>
+                <w:iCs w:val="false"/>
+                <w:sz w:val="20"/>
+                <w:szCs w:val="20"/>
+              </w:rPr>
+              <w:t xml:space="preserve">T_serial</w:t>
+            </w:r>
+          </w:p>
+        </w:tc>
+        <w:tc>
+          <w:tcPr>
+            <w:tcW w:type="dxa" w:w="2340"/>
+            <w:tcBorders>
+              <w:bottom w:val="single" w:color="000000" w:sz="6"/>
+            </w:tcBorders>
+            <w:tcMar>
+              <w:top w:type="dxa" w:w="40"/>
+              <w:left w:type="dxa" w:w="80"/>
+              <w:bottom w:type="dxa" w:w="40"/>
+              <w:right w:type="dxa" w:w="80"/>
+            </w:tcMar>
+          </w:tcPr>
+          <w:p>
+            <w:pPr>
+              <w:spacing w:line="240"/>
+            </w:pPr>
+            <w:r>
+              <w:rPr>
+                <w:rFonts w:ascii="Times New Roman" w:cs="Times New Roman" w:eastAsia="Times New Roman" w:hAnsi="Times New Roman"/>
+                <w:i w:val="false"/>
+                <w:iCs w:val="false"/>
+                <w:sz w:val="20"/>
+                <w:szCs w:val="20"/>
+              </w:rPr>
+              <w:t xml:space="preserve">8 procesos</w:t>
+            </w:r>
+          </w:p>
+        </w:tc>
+        <w:tc>
+          <w:tcPr>
+            <w:tcW w:type="dxa" w:w="2340"/>
+            <w:tcBorders>
+              <w:bottom w:val="single" w:color="000000" w:sz="6"/>
+            </w:tcBorders>
+            <w:tcMar>
+              <w:top w:type="dxa" w:w="40"/>
+              <w:left w:type="dxa" w:w="80"/>
+              <w:bottom w:type="dxa" w:w="40"/>
+              <w:right w:type="dxa" w:w="80"/>
+            </w:tcMar>
+          </w:tcPr>
+          <w:p>
+            <w:pPr>
+              <w:spacing w:line="240"/>
+            </w:pPr>
+            <w:r>
+              <w:rPr>
+                <w:rFonts w:ascii="Times New Roman" w:cs="Times New Roman" w:eastAsia="Times New Roman" w:hAnsi="Times New Roman"/>
+                <w:i w:val="false"/>
+                <w:iCs w:val="false"/>
+                <w:sz w:val="20"/>
+                <w:szCs w:val="20"/>
+              </w:rPr>
+              <w:t xml:space="preserve">Speedup</w:t>
+            </w:r>
+          </w:p>
+        </w:tc>
+      </w:tr>
+      <w:tr>
+        <w:trPr>
+          <w:tblHeader w:val="off"/>
+        </w:trPr>
+        <w:tc>
+          <w:tcPr>
+            <w:tcW w:type="dxa" w:w="2340"/>
+            <w:tcMar>
+              <w:top w:type="dxa" w:w="40"/>
+              <w:left w:type="dxa" w:w="80"/>
+              <w:bottom w:type="dxa" w:w="40"/>
+              <w:right w:type="dxa" w:w="80"/>
+            </w:tcMar>
+          </w:tcPr>
+          <w:p>
+            <w:pPr>
+              <w:spacing w:line="240"/>
+            </w:pPr>
+            <w:r>
+              <w:rPr>
+                <w:rFonts w:ascii="Times New Roman" w:cs="Times New Roman" w:eastAsia="Times New Roman" w:hAnsi="Times New Roman"/>
+                <w:i w:val="false"/>
+                <w:iCs w:val="false"/>
+                <w:sz w:val="20"/>
+                <w:szCs w:val="20"/>
+              </w:rPr>
+              <w:t xml:space="preserve">5</w:t>
+            </w:r>
+          </w:p>
+        </w:tc>
+        <w:tc>
+          <w:tcPr>
+            <w:tcW w:type="dxa" w:w="2340"/>
+            <w:tcMar>
+              <w:top w:type="dxa" w:w="40"/>
+              <w:left w:type="dxa" w:w="80"/>
+              <w:bottom w:type="dxa" w:w="40"/>
+              <w:right w:type="dxa" w:w="80"/>
+            </w:tcMar>
+          </w:tcPr>
+          <w:p>
+            <w:pPr>
+              <w:spacing w:line="240"/>
+            </w:pPr>
+            <w:r>
+              <w:rPr>
+                <w:rFonts w:ascii="Times New Roman" w:cs="Times New Roman" w:eastAsia="Times New Roman" w:hAnsi="Times New Roman"/>
+                <w:i w:val="false"/>
+                <w:iCs w:val="false"/>
+                <w:sz w:val="20"/>
+                <w:szCs w:val="20"/>
+              </w:rPr>
+              <w:t xml:space="preserve">0.3582 s</w:t>
+            </w:r>
+          </w:p>
+        </w:tc>
+        <w:tc>
+          <w:tcPr>
+            <w:tcW w:type="dxa" w:w="2340"/>
+            <w:tcMar>
+              <w:top w:type="dxa" w:w="40"/>
+              <w:left w:type="dxa" w:w="80"/>
+              <w:bottom w:type="dxa" w:w="40"/>
+              <w:right w:type="dxa" w:w="80"/>
+            </w:tcMar>
+          </w:tcPr>
+          <w:p>
+            <w:pPr>
+              <w:spacing w:line="240"/>
+            </w:pPr>
+            <w:r>
+              <w:rPr>
+                <w:rFonts w:ascii="Times New Roman" w:cs="Times New Roman" w:eastAsia="Times New Roman" w:hAnsi="Times New Roman"/>
+                <w:i w:val="false"/>
+                <w:iCs w:val="false"/>
+                <w:sz w:val="20"/>
+                <w:szCs w:val="20"/>
+              </w:rPr>
+              <w:t xml:space="preserve">0.0672 s</w:t>
+            </w:r>
+          </w:p>
+        </w:tc>
+        <w:tc>
+          <w:tcPr>
+            <w:tcW w:type="dxa" w:w="2340"/>
+            <w:tcMar>
+              <w:top w:type="dxa" w:w="40"/>
+              <w:left w:type="dxa" w:w="80"/>
+              <w:bottom w:type="dxa" w:w="40"/>
+              <w:right w:type="dxa" w:w="80"/>
+            </w:tcMar>
+          </w:tcPr>
+          <w:p>
+            <w:pPr>
+              <w:spacing w:line="240"/>
+            </w:pPr>
+            <w:r>
+              <w:rPr>
+                <w:rFonts w:ascii="Times New Roman" w:cs="Times New Roman" w:eastAsia="Times New Roman" w:hAnsi="Times New Roman"/>
+                <w:i w:val="false"/>
+                <w:iCs w:val="false"/>
+                <w:sz w:val="20"/>
+                <w:szCs w:val="20"/>
+              </w:rPr>
+              <w:t xml:space="preserve">5.33</w:t>
+            </w:r>
+          </w:p>
+        </w:tc>
+      </w:tr>
+      <w:tr>
+        <w:trPr>
+          <w:tblHeader w:val="off"/>
+        </w:trPr>
+        <w:tc>
+          <w:tcPr>
+            <w:tcW w:type="dxa" w:w="2340"/>
+            <w:tcMar>
+              <w:top w:type="dxa" w:w="40"/>
+              <w:left w:type="dxa" w:w="80"/>
+              <w:bottom w:type="dxa" w:w="40"/>
+              <w:right w:type="dxa" w:w="80"/>
+            </w:tcMar>
+          </w:tcPr>
+          <w:p>
+            <w:pPr>
+              <w:spacing w:line="240"/>
+            </w:pPr>
+            <w:r>
+              <w:rPr>
+                <w:rFonts w:ascii="Times New Roman" w:cs="Times New Roman" w:eastAsia="Times New Roman" w:hAnsi="Times New Roman"/>
+                <w:i w:val="false"/>
+                <w:iCs w:val="false"/>
+                <w:sz w:val="20"/>
+                <w:szCs w:val="20"/>
+              </w:rPr>
+              <w:t xml:space="preserve">10</w:t>
+            </w:r>
+          </w:p>
+        </w:tc>
+        <w:tc>
+          <w:tcPr>
+            <w:tcW w:type="dxa" w:w="2340"/>
+            <w:tcMar>
+              <w:top w:type="dxa" w:w="40"/>
+              <w:left w:type="dxa" w:w="80"/>
+              <w:bottom w:type="dxa" w:w="40"/>
+              <w:right w:type="dxa" w:w="80"/>
+            </w:tcMar>
+          </w:tcPr>
+          <w:p>
+            <w:pPr>
+              <w:spacing w:line="240"/>
+            </w:pPr>
+            <w:r>
+              <w:rPr>
+                <w:rFonts w:ascii="Times New Roman" w:cs="Times New Roman" w:eastAsia="Times New Roman" w:hAnsi="Times New Roman"/>
+                <w:i w:val="false"/>
+                <w:iCs w:val="false"/>
+                <w:sz w:val="20"/>
+                <w:szCs w:val="20"/>
+              </w:rPr>
+              <w:t xml:space="preserve">0.3864 s</w:t>
+            </w:r>
+          </w:p>
+        </w:tc>
+        <w:tc>
+          <w:tcPr>
+            <w:tcW w:type="dxa" w:w="2340"/>
+            <w:tcMar>
+              <w:top w:type="dxa" w:w="40"/>
+              <w:left w:type="dxa" w:w="80"/>
+              <w:bottom w:type="dxa" w:w="40"/>
+              <w:right w:type="dxa" w:w="80"/>
+            </w:tcMar>
+          </w:tcPr>
+          <w:p>
+            <w:pPr>
+              <w:spacing w:line="240"/>
+            </w:pPr>
+            <w:r>
+              <w:rPr>
+                <w:rFonts w:ascii="Times New Roman" w:cs="Times New Roman" w:eastAsia="Times New Roman" w:hAnsi="Times New Roman"/>
+                <w:i w:val="false"/>
+                <w:iCs w:val="false"/>
+                <w:sz w:val="20"/>
+                <w:szCs w:val="20"/>
+              </w:rPr>
+              <w:t xml:space="preserve">0.0728 s</w:t>
+            </w:r>
+          </w:p>
+        </w:tc>
+        <w:tc>
+          <w:tcPr>
+            <w:tcW w:type="dxa" w:w="2340"/>
+            <w:tcMar>
+              <w:top w:type="dxa" w:w="40"/>
+              <w:left w:type="dxa" w:w="80"/>
+              <w:bottom w:type="dxa" w:w="40"/>
+              <w:right w:type="dxa" w:w="80"/>
+            </w:tcMar>
+          </w:tcPr>
+          <w:p>
+            <w:pPr>
+              <w:spacing w:line="240"/>
+            </w:pPr>
+            <w:r>
+              <w:rPr>
+                <w:rFonts w:ascii="Times New Roman" w:cs="Times New Roman" w:eastAsia="Times New Roman" w:hAnsi="Times New Roman"/>
+                <w:i w:val="false"/>
+                <w:iCs w:val="false"/>
+                <w:sz w:val="20"/>
+                <w:szCs w:val="20"/>
+              </w:rPr>
+              <w:t xml:space="preserve">5.31</w:t>
+            </w:r>
+          </w:p>
+        </w:tc>
+      </w:tr>
+      <w:tr>
+        <w:trPr>
+          <w:tblHeader w:val="off"/>
+        </w:trPr>
+        <w:tc>
+          <w:tcPr>
+            <w:tcW w:type="dxa" w:w="2340"/>
+            <w:tcMar>
+              <w:top w:type="dxa" w:w="40"/>
+              <w:left w:type="dxa" w:w="80"/>
+              <w:bottom w:type="dxa" w:w="40"/>
+              <w:right w:type="dxa" w:w="80"/>
+            </w:tcMar>
+          </w:tcPr>
+          <w:p>
+            <w:pPr>
+              <w:spacing w:line="240"/>
+            </w:pPr>
+            <w:r>
+              <w:rPr>
+                <w:rFonts w:ascii="Times New Roman" w:cs="Times New Roman" w:eastAsia="Times New Roman" w:hAnsi="Times New Roman"/>
+                <w:i w:val="false"/>
+                <w:iCs w:val="false"/>
+                <w:sz w:val="20"/>
+                <w:szCs w:val="20"/>
+              </w:rPr>
+              <w:t xml:space="preserve">23</w:t>
+            </w:r>
+          </w:p>
+        </w:tc>
+        <w:tc>
+          <w:tcPr>
+            <w:tcW w:type="dxa" w:w="2340"/>
+            <w:tcMar>
+              <w:top w:type="dxa" w:w="40"/>
+              <w:left w:type="dxa" w:w="80"/>
+              <w:bottom w:type="dxa" w:w="40"/>
+              <w:right w:type="dxa" w:w="80"/>
+            </w:tcMar>
+          </w:tcPr>
+          <w:p>
+            <w:pPr>
+              <w:spacing w:line="240"/>
+            </w:pPr>
+            <w:r>
+              <w:rPr>
+                <w:rFonts w:ascii="Times New Roman" w:cs="Times New Roman" w:eastAsia="Times New Roman" w:hAnsi="Times New Roman"/>
+                <w:i w:val="false"/>
+                <w:iCs w:val="false"/>
+                <w:sz w:val="20"/>
+                <w:szCs w:val="20"/>
+              </w:rPr>
+              <w:t xml:space="preserve">0.4576 s</w:t>
+            </w:r>
+          </w:p>
+        </w:tc>
+        <w:tc>
+          <w:tcPr>
+            <w:tcW w:type="dxa" w:w="2340"/>
+            <w:tcMar>
+              <w:top w:type="dxa" w:w="40"/>
+              <w:left w:type="dxa" w:w="80"/>
+              <w:bottom w:type="dxa" w:w="40"/>
+              <w:right w:type="dxa" w:w="80"/>
+            </w:tcMar>
+          </w:tcPr>
+          <w:p>
+            <w:pPr>
+              <w:spacing w:line="240"/>
+            </w:pPr>
+            <w:r>
+              <w:rPr>
+                <w:rFonts w:ascii="Times New Roman" w:cs="Times New Roman" w:eastAsia="Times New Roman" w:hAnsi="Times New Roman"/>
+                <w:i w:val="false"/>
+                <w:iCs w:val="false"/>
+                <w:sz w:val="20"/>
+                <w:szCs w:val="20"/>
+              </w:rPr>
+              <w:t xml:space="preserve">0.0836 s</w:t>
+            </w:r>
+          </w:p>
+        </w:tc>
+        <w:tc>
+          <w:tcPr>
+            <w:tcW w:type="dxa" w:w="2340"/>
+            <w:tcMar>
+              <w:top w:type="dxa" w:w="40"/>
+              <w:left w:type="dxa" w:w="80"/>
+              <w:bottom w:type="dxa" w:w="40"/>
+              <w:right w:type="dxa" w:w="80"/>
+            </w:tcMar>
+          </w:tcPr>
+          <w:p>
+            <w:pPr>
+              <w:spacing w:line="240"/>
+            </w:pPr>
+            <w:r>
+              <w:rPr>
+                <w:rFonts w:ascii="Times New Roman" w:cs="Times New Roman" w:eastAsia="Times New Roman" w:hAnsi="Times New Roman"/>
+                <w:i w:val="false"/>
+                <w:iCs w:val="false"/>
+                <w:sz w:val="20"/>
+                <w:szCs w:val="20"/>
+              </w:rPr>
+              <w:t xml:space="preserve">5.47</w:t>
+            </w:r>
+          </w:p>
+        </w:tc>
+      </w:tr>
+      <w:tr>
+        <w:trPr>
+          <w:tblHeader w:val="off"/>
+        </w:trPr>
+        <w:tc>
+          <w:tcPr>
+            <w:tcW w:type="dxa" w:w="2340"/>
+            <w:tcMar>
+              <w:top w:type="dxa" w:w="40"/>
+              <w:left w:type="dxa" w:w="80"/>
+              <w:bottom w:type="dxa" w:w="40"/>
+              <w:right w:type="dxa" w:w="80"/>
+            </w:tcMar>
+          </w:tcPr>
+          <w:p>
+            <w:pPr>
+              <w:spacing w:line="240"/>
+            </w:pPr>
+            <w:r>
+              <w:rPr>
+                <w:rFonts w:ascii="Times New Roman" w:cs="Times New Roman" w:eastAsia="Times New Roman" w:hAnsi="Times New Roman"/>
+                <w:i w:val="false"/>
+                <w:iCs w:val="false"/>
+                <w:sz w:val="20"/>
+                <w:szCs w:val="20"/>
+              </w:rPr>
+              <w:t xml:space="preserve">50</w:t>
+            </w:r>
+          </w:p>
+        </w:tc>
+        <w:tc>
+          <w:tcPr>
+            <w:tcW w:type="dxa" w:w="2340"/>
+            <w:tcMar>
+              <w:top w:type="dxa" w:w="40"/>
+              <w:left w:type="dxa" w:w="80"/>
+              <w:bottom w:type="dxa" w:w="40"/>
+              <w:right w:type="dxa" w:w="80"/>
+            </w:tcMar>
+          </w:tcPr>
+          <w:p>
+            <w:pPr>
+              <w:spacing w:line="240"/>
+            </w:pPr>
+            <w:r>
+              <w:rPr>
+                <w:rFonts w:ascii="Times New Roman" w:cs="Times New Roman" w:eastAsia="Times New Roman" w:hAnsi="Times New Roman"/>
+                <w:i w:val="false"/>
+                <w:iCs w:val="false"/>
+                <w:sz w:val="20"/>
+                <w:szCs w:val="20"/>
+              </w:rPr>
+              <w:t xml:space="preserve">0.5083 s</w:t>
+            </w:r>
+          </w:p>
+        </w:tc>
+        <w:tc>
+          <w:tcPr>
+            <w:tcW w:type="dxa" w:w="2340"/>
+            <w:tcMar>
+              <w:top w:type="dxa" w:w="40"/>
+              <w:left w:type="dxa" w:w="80"/>
+              <w:bottom w:type="dxa" w:w="40"/>
+              <w:right w:type="dxa" w:w="80"/>
+            </w:tcMar>
+          </w:tcPr>
+          <w:p>
+            <w:pPr>
+              <w:spacing w:line="240"/>
+            </w:pPr>
+            <w:r>
+              <w:rPr>
+                <w:rFonts w:ascii="Times New Roman" w:cs="Times New Roman" w:eastAsia="Times New Roman" w:hAnsi="Times New Roman"/>
+                <w:i w:val="false"/>
+                <w:iCs w:val="false"/>
+                <w:sz w:val="20"/>
+                <w:szCs w:val="20"/>
+              </w:rPr>
+              <w:t xml:space="preserve">0.0879 s</w:t>
+            </w:r>
+          </w:p>
+        </w:tc>
+        <w:tc>
+          <w:tcPr>
+            <w:tcW w:type="dxa" w:w="2340"/>
+            <w:tcMar>
+              <w:top w:type="dxa" w:w="40"/>
+              <w:left w:type="dxa" w:w="80"/>
+              <w:bottom w:type="dxa" w:w="40"/>
+              <w:right w:type="dxa" w:w="80"/>
+            </w:tcMar>
+          </w:tcPr>
+          <w:p>
+            <w:pPr>
+              <w:spacing w:line="240"/>
+            </w:pPr>
+            <w:r>
+              <w:rPr>
+                <w:rFonts w:ascii="Times New Roman" w:cs="Times New Roman" w:eastAsia="Times New Roman" w:hAnsi="Times New Roman"/>
+                <w:i w:val="false"/>
+                <w:iCs w:val="false"/>
+                <w:sz w:val="20"/>
+                <w:szCs w:val="20"/>
+              </w:rPr>
+              <w:t xml:space="preserve">5.78</w:t>
+            </w:r>
+          </w:p>
+        </w:tc>
+      </w:tr>
+      <w:tr>
+        <w:trPr>
+          <w:tblHeader w:val="off"/>
+        </w:trPr>
+        <w:tc>
+          <w:tcPr>
+            <w:tcW w:type="dxa" w:w="2340"/>
+            <w:tcMar>
+              <w:top w:type="dxa" w:w="40"/>
+              <w:left w:type="dxa" w:w="80"/>
+              <w:bottom w:type="dxa" w:w="40"/>
+              <w:right w:type="dxa" w:w="80"/>
+            </w:tcMar>
+          </w:tcPr>
+          <w:p>
+            <w:pPr>
+              <w:spacing w:line="240"/>
+            </w:pPr>
+            <w:r>
+              <w:rPr>
+                <w:rFonts w:ascii="Times New Roman" w:cs="Times New Roman" w:eastAsia="Times New Roman" w:hAnsi="Times New Roman"/>
+                <w:i w:val="false"/>
+                <w:iCs w:val="false"/>
+                <w:sz w:val="20"/>
+                <w:szCs w:val="20"/>
+              </w:rPr>
+              <w:t xml:space="preserve">100</w:t>
+            </w:r>
+          </w:p>
+        </w:tc>
+        <w:tc>
+          <w:tcPr>
+            <w:tcW w:type="dxa" w:w="2340"/>
+            <w:tcMar>
+              <w:top w:type="dxa" w:w="40"/>
+              <w:left w:type="dxa" w:w="80"/>
+              <w:bottom w:type="dxa" w:w="40"/>
+              <w:right w:type="dxa" w:w="80"/>
+            </w:tcMar>
+          </w:tcPr>
+          <w:p>
+            <w:pPr>
+              <w:spacing w:line="240"/>
+            </w:pPr>
+            <w:r>
+              <w:rPr>
+                <w:rFonts w:ascii="Times New Roman" w:cs="Times New Roman" w:eastAsia="Times New Roman" w:hAnsi="Times New Roman"/>
+                <w:i w:val="false"/>
+                <w:iCs w:val="false"/>
+                <w:sz w:val="20"/>
+                <w:szCs w:val="20"/>
+              </w:rPr>
+              <w:t xml:space="preserve">0.5134 s</w:t>
+            </w:r>
+          </w:p>
+        </w:tc>
+        <w:tc>
+          <w:tcPr>
+            <w:tcW w:type="dxa" w:w="2340"/>
+            <w:tcMar>
+              <w:top w:type="dxa" w:w="40"/>
+              <w:left w:type="dxa" w:w="80"/>
+              <w:bottom w:type="dxa" w:w="40"/>
+              <w:right w:type="dxa" w:w="80"/>
+            </w:tcMar>
+          </w:tcPr>
+          <w:p>
+            <w:pPr>
+              <w:spacing w:line="240"/>
+            </w:pPr>
+            <w:r>
+              <w:rPr>
+                <w:rFonts w:ascii="Times New Roman" w:cs="Times New Roman" w:eastAsia="Times New Roman" w:hAnsi="Times New Roman"/>
+                <w:i w:val="false"/>
+                <w:iCs w:val="false"/>
+                <w:sz w:val="20"/>
+                <w:szCs w:val="20"/>
+              </w:rPr>
+              <w:t xml:space="preserve">0.0889 s</w:t>
+            </w:r>
+          </w:p>
+        </w:tc>
+        <w:tc>
+          <w:tcPr>
+            <w:tcW w:type="dxa" w:w="2340"/>
+            <w:tcMar>
+              <w:top w:type="dxa" w:w="40"/>
+              <w:left w:type="dxa" w:w="80"/>
+              <w:bottom w:type="dxa" w:w="40"/>
+              <w:right w:type="dxa" w:w="80"/>
+            </w:tcMar>
+          </w:tcPr>
+          <w:p>
+            <w:pPr>
+              <w:spacing w:line="240"/>
+            </w:pPr>
+            <w:r>
+              <w:rPr>
+                <w:rFonts w:ascii="Times New Roman" w:cs="Times New Roman" w:eastAsia="Times New Roman" w:hAnsi="Times New Roman"/>
+                <w:i w:val="false"/>
+                <w:iCs w:val="false"/>
+                <w:sz w:val="20"/>
+                <w:szCs w:val="20"/>
+              </w:rPr>
+              <w:t xml:space="preserve">5.78</w:t>
+            </w:r>
+          </w:p>
+        </w:tc>
+      </w:tr>
+      <w:tr>
+        <w:trPr>
+          <w:tblHeader w:val="off"/>
+        </w:trPr>
+        <w:tc>
+          <w:tcPr>
+            <w:tcW w:type="dxa" w:w="2340"/>
+            <w:tcMar>
+              <w:top w:type="dxa" w:w="40"/>
+              <w:left w:type="dxa" w:w="80"/>
+              <w:bottom w:type="dxa" w:w="40"/>
+              <w:right w:type="dxa" w:w="80"/>
+            </w:tcMar>
+          </w:tcPr>
+          <w:p>
+            <w:pPr>
+              <w:spacing w:line="240"/>
+            </w:pPr>
+            <w:r>
+              <w:rPr>
+                <w:rFonts w:ascii="Times New Roman" w:cs="Times New Roman" w:eastAsia="Times New Roman" w:hAnsi="Times New Roman"/>
+                <w:i w:val="false"/>
+                <w:iCs w:val="false"/>
+                <w:sz w:val="20"/>
+                <w:szCs w:val="20"/>
+              </w:rPr>
+              <w:t xml:space="preserve">200</w:t>
+            </w:r>
+          </w:p>
+        </w:tc>
+        <w:tc>
+          <w:tcPr>
+            <w:tcW w:type="dxa" w:w="2340"/>
+            <w:tcMar>
+              <w:top w:type="dxa" w:w="40"/>
+              <w:left w:type="dxa" w:w="80"/>
+              <w:bottom w:type="dxa" w:w="40"/>
+              <w:right w:type="dxa" w:w="80"/>
+            </w:tcMar>
+          </w:tcPr>
+          <w:p>
+            <w:pPr>
+              <w:spacing w:line="240"/>
+            </w:pPr>
+            <w:r>
+              <w:rPr>
+                <w:rFonts w:ascii="Times New Roman" w:cs="Times New Roman" w:eastAsia="Times New Roman" w:hAnsi="Times New Roman"/>
+                <w:i w:val="false"/>
+                <w:iCs w:val="false"/>
+                <w:sz w:val="20"/>
+                <w:szCs w:val="20"/>
+              </w:rPr>
+              <w:t xml:space="preserve">0.5166 s</w:t>
+            </w:r>
+          </w:p>
+        </w:tc>
+        <w:tc>
+          <w:tcPr>
+            <w:tcW w:type="dxa" w:w="2340"/>
+            <w:tcMar>
+              <w:top w:type="dxa" w:w="40"/>
+              <w:left w:type="dxa" w:w="80"/>
+              <w:bottom w:type="dxa" w:w="40"/>
+              <w:right w:type="dxa" w:w="80"/>
+            </w:tcMar>
+          </w:tcPr>
+          <w:p>
+            <w:pPr>
+              <w:spacing w:line="240"/>
+            </w:pPr>
+            <w:r>
+              <w:rPr>
+                <w:rFonts w:ascii="Times New Roman" w:cs="Times New Roman" w:eastAsia="Times New Roman" w:hAnsi="Times New Roman"/>
+                <w:i w:val="false"/>
+                <w:iCs w:val="false"/>
+                <w:sz w:val="20"/>
+                <w:szCs w:val="20"/>
+              </w:rPr>
+              <w:t xml:space="preserve">0.0876 s</w:t>
+            </w:r>
+          </w:p>
+        </w:tc>
+        <w:tc>
+          <w:tcPr>
+            <w:tcW w:type="dxa" w:w="2340"/>
+            <w:tcMar>
+              <w:top w:type="dxa" w:w="40"/>
+              <w:left w:type="dxa" w:w="80"/>
+              <w:bottom w:type="dxa" w:w="40"/>
+              <w:right w:type="dxa" w:w="80"/>
+            </w:tcMar>
+          </w:tcPr>
+          <w:p>
+            <w:pPr>
+              <w:spacing w:line="240"/>
+            </w:pPr>
+            <w:r>
+              <w:rPr>
+                <w:rFonts w:ascii="Times New Roman" w:cs="Times New Roman" w:eastAsia="Times New Roman" w:hAnsi="Times New Roman"/>
+                <w:i w:val="false"/>
+                <w:iCs w:val="false"/>
+                <w:sz w:val="20"/>
+                <w:szCs w:val="20"/>
+              </w:rPr>
+              <w:t xml:space="preserve">5.90</w:t>
+            </w:r>
+          </w:p>
+        </w:tc>
+      </w:tr>
+    </w:tbl>
+    <w:p>
+      <w:pPr>
+        <w:spacing w:after="240"/>
+      </w:pPr>
+      <w:r>
+        <w:rPr>
+          <w:rFonts w:ascii="Times New Roman" w:cs="Times New Roman" w:eastAsia="Times New Roman" w:hAnsi="Times New Roman"/>
+          <w:sz w:val="24"/>
+          <w:szCs w:val="24"/>
+        </w:rPr>
+        <w:t xml:space="preserve"/>
+      </w:r>
+    </w:p>
+    <w:p>
+      <w:pPr>
+        <w:spacing w:before="240" w:line="240"/>
+      </w:pPr>
+      <w:r>
+        <w:rPr>
+          <w:rFonts w:ascii="Times New Roman" w:cs="Times New Roman" w:eastAsia="Times New Roman" w:hAnsi="Times New Roman"/>
+          <w:b/>
+          <w:bCs/>
+          <w:sz w:val="24"/>
+          <w:szCs w:val="24"/>
+        </w:rPr>
+        <w:t xml:space="preserve">Figura 22</w:t>
+      </w:r>
+    </w:p>
+    <w:p>
+      <w:pPr>
+        <w:spacing w:after="80" w:line="240"/>
+      </w:pPr>
+      <w:r>
+        <w:rPr>
+          <w:rFonts w:ascii="Times New Roman" w:cs="Times New Roman" w:eastAsia="Times New Roman" w:hAnsi="Times New Roman"/>
+          <w:i/>
+          <w:iCs/>
+          <w:sz w:val="24"/>
+          <w:szCs w:val="24"/>
+        </w:rPr>
+        <w:t xml:space="preserve">Efecto del tamaño del grupo K</w:t>
+      </w:r>
+    </w:p>
+    <w:p>
+      <w:pPr>
+        <w:spacing w:after="240" w:line="240"/>
+        <w:jc w:val="center"/>
+      </w:pPr>
+      <w:r>
+        <w:drawing>
+          <wp:inline distT="0" distB="0" distL="0" distR="0">
+            <wp:extent cx="5143500" cy="2105025"/>
+            <wp:effectExtent t="0" r="0" b="0" l="0"/>
+            <wp:docPr id="22" name="" descr="" title=""/>
+            <wp:cNvGraphicFramePr>
+              <a:graphicFrameLocks xmlns:a="http://schemas.openxmlformats.org/drawingml/2006/main" noChangeAspect="1"/>
+            </wp:cNvGraphicFramePr>
+            <a:graphic xmlns:a="http://schemas.openxmlformats.org/drawingml/2006/main">
+              <a:graphicData uri="http://schemas.openxmlformats.org/drawingml/2006/picture">
+                <pic:pic xmlns:pic="http://schemas.openxmlformats.org/drawingml/2006/picture">
+                  <pic:nvPicPr>
+                    <pic:cNvPr id="0" name="" descr=""/>
+                    <pic:cNvPicPr>
+                      <a:picLocks noChangeAspect="1" noChangeArrowheads="1"/>
+                    </pic:cNvPicPr>
+                  </pic:nvPicPr>
+                  <pic:blipFill>
+                    <a:blip r:embed="rId28" cstate="none"/>
+                    <a:srcRect/>
+                    <a:stretch>
+                      <a:fillRect/>
+                    </a:stretch>
+                  </pic:blipFill>
+                  <pic:spPr bwMode="auto">
+                    <a:xfrm>
+                      <a:off x="0" y="0"/>
+                      <a:ext cx="5143500" cy="2105025"/>
+                    </a:xfrm>
+                    <a:prstGeom prst="rect">
+                      <a:avLst/>
+                    </a:prstGeom>
+                  </pic:spPr>
+                </pic:pic>
+              </a:graphicData>
+            </a:graphic>
+          </wp:inline>
+        </w:drawing>
+      </w:r>
+    </w:p>
+    <w:p>
+      <w:pPr>
+        <w:spacing w:line="480"/>
+        <w:ind w:firstLine="720"/>
+      </w:pPr>
+      <w:r>
+        <w:rPr>
+          <w:rFonts w:ascii="Times New Roman" w:cs="Times New Roman" w:eastAsia="Times New Roman" w:hAnsi="Times New Roman"/>
+          <w:sz w:val="24"/>
+          <w:szCs w:val="24"/>
+        </w:rPr>
+        <w:t xml:space="preserve">El valor de K prácticamente </w:t>
+      </w:r>
+      <w:r>
+        <w:rPr>
+          <w:rFonts w:ascii="Times New Roman" w:cs="Times New Roman" w:eastAsia="Times New Roman" w:hAnsi="Times New Roman"/>
+          <w:b/>
+          <w:bCs/>
+          <w:sz w:val="24"/>
+          <w:szCs w:val="24"/>
+        </w:rPr>
+        <w:t xml:space="preserve">no influye sobre el speedup</w:t>
+      </w:r>
+      <w:r>
+        <w:rPr>
+          <w:rFonts w:ascii="Times New Roman" w:cs="Times New Roman" w:eastAsia="Times New Roman" w:hAnsi="Times New Roman"/>
+          <w:sz w:val="24"/>
+          <w:szCs w:val="24"/>
+        </w:rPr>
+        <w:t xml:space="preserve">, que se mantiene entre 5.3 y 5.9 mientras K varía en un factor de cuarenta. La leve tendencia creciente es consistente con el mismo argumento anterior (más trabajo por unidad diluye los costos fijos), pero su magnitud es pequeña comparada con el efecto de T. El resultado es esperable: modificar K cambia el trabajo contenido en cada unidad, pero no la forma en que esas unidades se reparten entre los procesos, que sigue siendo equitativa, ni el volumen de comunicación, que continúa siendo un único entero por proceso.</w:t>
+      </w:r>
+    </w:p>
+    <w:p>
+      <w:pPr>
+        <w:spacing w:line="480"/>
+        <w:ind w:firstLine="720"/>
+      </w:pPr>
+      <w:r>
+        <w:rPr>
+          <w:rFonts w:ascii="Times New Roman" w:cs="Times New Roman" w:eastAsia="Times New Roman" w:hAnsi="Times New Roman"/>
+          <w:sz w:val="24"/>
+          <w:szCs w:val="24"/>
+        </w:rPr>
+        <w:t xml:space="preserve">Resulta llamativo que el tiempo serial apenas aumente a partir de K=50 pese a seguir duplicándose la cantidad de personas. La explicación está en el corte temprano del algoritmo: con cincuenta personas la coincidencia es casi segura, de modo que el bucle se interrumpe mucho antes de llegar a la última persona y el resto nunca se sortea.</w:t>
+      </w:r>
+    </w:p>
+    <w:p>
+      <w:pPr>
+        <w:spacing w:line="480"/>
+        <w:ind w:left="720"/>
+      </w:pPr>
+      <w:r>
+        <w:rPr>
+          <w:rFonts w:ascii="Times New Roman" w:cs="Times New Roman" w:eastAsia="Times New Roman" w:hAnsi="Times New Roman"/>
+          <w:b/>
+          <w:bCs/>
+          <w:sz w:val="24"/>
+          <w:szCs w:val="24"/>
+        </w:rPr>
+        <w:t xml:space="preserve">Nota metodológica:</w:t>
+      </w:r>
+      <w:r>
+        <w:rPr>
+          <w:rFonts w:ascii="Times New Roman" w:cs="Times New Roman" w:eastAsia="Times New Roman" w:hAnsi="Times New Roman"/>
+          <w:sz w:val="24"/>
+          <w:szCs w:val="24"/>
+        </w:rPr>
+        <w:t xml:space="preserve"> los tiempos de esta sección se midieron con una copia de los programas que imprime siete decimales en lugar de tres, porque con mil grupos los valores son del orden de la décima de milisegundo y la precisión original los redondeaba. Los datos crudos están en </w:t>
+      </w:r>
+      <w:r>
+        <w:rPr>
+          <w:rFonts w:ascii="Courier New" w:cs="Courier New" w:eastAsia="Courier New" w:hAnsi="Courier New"/>
+          <w:sz w:val="24"/>
+          <w:szCs w:val="24"/>
+        </w:rPr>
+        <w:t xml:space="preserve">resultados/tamanio/</w:t>
+      </w:r>
+      <w:r>
+        <w:rPr>
+          <w:rFonts w:ascii="Times New Roman" w:cs="Times New Roman" w:eastAsia="Times New Roman" w:hAnsi="Times New Roman"/>
+          <w:sz w:val="24"/>
+          <w:szCs w:val="24"/>
+        </w:rPr>
+        <w:t xml:space="preserve">.</w:t>
       </w:r>
     </w:p>
     <w:p>

</xml_diff>